<commit_message>
Generate deck-text.docx from content.js
The fill-in Word copy was hand-maintained and had drifted from the deck.
scripts/deck-doc.mjs now builds it straight from content.js, so the two
cannot disagree:

  npm run deck-doc

Every editable line becomes a labelled row and the unfilled TODO() values
are highlighted, so the gaps are visible at a glance. Slide headings come
from each slide's nav label rather than its type, since types are reused
now that Sections 3-5 exist. A slide carrying a field the label map does
not know about is reported and appended rather than silently dropped.

The closing section holds drafting space for Section 2, the one item on
the README checklist with no slides.

Adds docx as a devDependency for the generator.

Co-Authored-By: Claude Opus 5 <noreply@anthropic.com>
Claude-Session: https://claude.ai/code/session_01TMEmoNH23WgHZZKSnM65g8
</commit_message>
<xml_diff>
--- a/deck-text.docx
+++ b/deck-text.docx
@@ -34,7 +34,7 @@
           <w:sz w:val="22"/>
           <w:szCs w:val="22"/>
         </w:rPr>
-        <w:t xml:space="preserve">28 highlighted blanks still need real information.</w:t>
+        <w:t xml:space="preserve">21 highlighted blanks still need real information.</w:t>
       </w:r>
     </w:p>
     <w:p>
@@ -186,24 +186,23 @@
         <w:tc>
           <w:tcPr>
             <w:tcW w:type="dxa" w:w="6260"/>
-            <w:shd w:fill="FFF3C4" w:val="clear"/>
-            <w:tcMar>
-              <w:top w:type="dxa" w:w="80"/>
-              <w:left w:type="dxa" w:w="120"/>
-              <w:bottom w:type="dxa" w:w="80"/>
-              <w:right w:type="dxa" w:w="120"/>
-            </w:tcMar>
-          </w:tcPr>
-          <w:p>
-            <w:r>
-              <w:rPr>
-                <w:b/>
-                <w:bCs/>
-                <w:color w:val="8A6100"/>
-                <w:sz w:val="21"/>
-                <w:szCs w:val="21"/>
-              </w:rPr>
-              <w:t xml:space="preserve">[FILL IN: Presenter name(s)]</w:t>
+            <w:tcMar>
+              <w:top w:type="dxa" w:w="80"/>
+              <w:left w:type="dxa" w:w="120"/>
+              <w:bottom w:type="dxa" w:w="80"/>
+              <w:right w:type="dxa" w:w="120"/>
+            </w:tcMar>
+          </w:tcPr>
+          <w:p>
+            <w:r>
+              <w:rPr>
+                <w:b w:val="false"/>
+                <w:bCs w:val="false"/>
+                <w:color w:val="000000"/>
+                <w:sz w:val="21"/>
+                <w:szCs w:val="21"/>
+              </w:rPr>
+              <w:t xml:space="preserve">Collin, Bryan, Bonga, Eduard, and Cole</w:t>
             </w:r>
           </w:p>
         </w:tc>
@@ -233,24 +232,23 @@
         <w:tc>
           <w:tcPr>
             <w:tcW w:type="dxa" w:w="6260"/>
-            <w:shd w:fill="FFF3C4" w:val="clear"/>
-            <w:tcMar>
-              <w:top w:type="dxa" w:w="80"/>
-              <w:left w:type="dxa" w:w="120"/>
-              <w:bottom w:type="dxa" w:w="80"/>
-              <w:right w:type="dxa" w:w="120"/>
-            </w:tcMar>
-          </w:tcPr>
-          <w:p>
-            <w:r>
-              <w:rPr>
-                <w:b/>
-                <w:bCs/>
-                <w:color w:val="8A6100"/>
-                <w:sz w:val="21"/>
-                <w:szCs w:val="21"/>
-              </w:rPr>
-              <w:t xml:space="preserve">[FILL IN: Class / course]</w:t>
+            <w:tcMar>
+              <w:top w:type="dxa" w:w="80"/>
+              <w:left w:type="dxa" w:w="120"/>
+              <w:bottom w:type="dxa" w:w="80"/>
+              <w:right w:type="dxa" w:w="120"/>
+            </w:tcMar>
+          </w:tcPr>
+          <w:p>
+            <w:r>
+              <w:rPr>
+                <w:b w:val="false"/>
+                <w:bCs w:val="false"/>
+                <w:color w:val="000000"/>
+                <w:sz w:val="21"/>
+                <w:szCs w:val="21"/>
+              </w:rPr>
+              <w:t xml:space="preserve">Power of Food</w:t>
             </w:r>
           </w:p>
         </w:tc>
@@ -446,7 +444,7 @@
         <w:spacing w:after="140" w:before="320"/>
       </w:pPr>
       <w:r>
-        <w:t xml:space="preserve">Slide 01 — Opening</w:t>
+        <w:t xml:space="preserve">Slide 01 — Open</w:t>
       </w:r>
     </w:p>
     <w:tbl>
@@ -826,7 +824,7 @@
           <w:sz w:val="18"/>
           <w:szCs w:val="18"/>
         </w:rPr>
-        <w:t xml:space="preserve">The list beside it shows all four chapter titles automatically.</w:t>
+        <w:t xml:space="preserve">The list beside it shows all 5 chapter titles automatically.</w:t>
       </w:r>
     </w:p>
     <w:p>
@@ -835,7 +833,7 @@
         <w:spacing w:after="140" w:before="320"/>
       </w:pPr>
       <w:r>
-        <w:t xml:space="preserve">Slide 03 — Meet Cole</w:t>
+        <w:t xml:space="preserve">Slide 03 — Cole</w:t>
       </w:r>
     </w:p>
     <w:tbl>
@@ -925,47 +923,46 @@
         <w:tc>
           <w:tcPr>
             <w:tcW w:type="dxa" w:w="6260"/>
-            <w:shd w:fill="FFF3C4" w:val="clear"/>
-            <w:tcMar>
-              <w:top w:type="dxa" w:w="80"/>
-              <w:left w:type="dxa" w:w="120"/>
-              <w:bottom w:type="dxa" w:w="80"/>
-              <w:right w:type="dxa" w:w="120"/>
-            </w:tcMar>
-          </w:tcPr>
-          <w:p>
-            <w:r>
-              <w:rPr>
-                <w:b/>
-                <w:bCs/>
-                <w:color w:val="8A6100"/>
-                <w:sz w:val="21"/>
-                <w:szCs w:val="21"/>
-              </w:rPr>
-              <w:t xml:space="preserve">[FILL IN: Cole — full name]</w:t>
-            </w:r>
-          </w:p>
-        </w:tc>
-      </w:tr>
-      <w:tr>
-        <w:tc>
-          <w:tcPr>
-            <w:tcW w:type="dxa" w:w="3100"/>
-            <w:tcMar>
-              <w:top w:type="dxa" w:w="80"/>
-              <w:left w:type="dxa" w:w="120"/>
-              <w:bottom w:type="dxa" w:w="80"/>
-              <w:right w:type="dxa" w:w="120"/>
-            </w:tcMar>
-          </w:tcPr>
-          <w:p>
-            <w:r>
-              <w:rPr>
-                <w:color w:val="555555"/>
-                <w:sz w:val="19"/>
-                <w:szCs w:val="19"/>
-              </w:rPr>
-              <w:t xml:space="preserve">Instrument (italic, after the name)</w:t>
+            <w:tcMar>
+              <w:top w:type="dxa" w:w="80"/>
+              <w:left w:type="dxa" w:w="120"/>
+              <w:bottom w:type="dxa" w:w="80"/>
+              <w:right w:type="dxa" w:w="120"/>
+            </w:tcMar>
+          </w:tcPr>
+          <w:p>
+            <w:r>
+              <w:rPr>
+                <w:b w:val="false"/>
+                <w:bCs w:val="false"/>
+                <w:color w:val="000000"/>
+                <w:sz w:val="21"/>
+                <w:szCs w:val="21"/>
+              </w:rPr>
+              <w:t xml:space="preserve">Cole</w:t>
+            </w:r>
+          </w:p>
+        </w:tc>
+      </w:tr>
+      <w:tr>
+        <w:tc>
+          <w:tcPr>
+            <w:tcW w:type="dxa" w:w="3100"/>
+            <w:tcMar>
+              <w:top w:type="dxa" w:w="80"/>
+              <w:left w:type="dxa" w:w="120"/>
+              <w:bottom w:type="dxa" w:w="80"/>
+              <w:right w:type="dxa" w:w="120"/>
+            </w:tcMar>
+          </w:tcPr>
+          <w:p>
+            <w:r>
+              <w:rPr>
+                <w:color w:val="555555"/>
+                <w:sz w:val="19"/>
+                <w:szCs w:val="19"/>
+              </w:rPr>
+              <w:t xml:space="preserve">Line under the name</w:t>
             </w:r>
           </w:p>
         </w:tc>
@@ -1011,6 +1008,52 @@
                 <w:sz w:val="19"/>
                 <w:szCs w:val="19"/>
               </w:rPr>
+              <w:t xml:space="preserve">Photo file (in public/)</w:t>
+            </w:r>
+          </w:p>
+        </w:tc>
+        <w:tc>
+          <w:tcPr>
+            <w:tcW w:type="dxa" w:w="6260"/>
+            <w:tcMar>
+              <w:top w:type="dxa" w:w="80"/>
+              <w:left w:type="dxa" w:w="120"/>
+              <w:bottom w:type="dxa" w:w="80"/>
+              <w:right w:type="dxa" w:w="120"/>
+            </w:tcMar>
+          </w:tcPr>
+          <w:p>
+            <w:r>
+              <w:rPr>
+                <w:b w:val="false"/>
+                <w:bCs w:val="false"/>
+                <w:color w:val="000000"/>
+                <w:sz w:val="21"/>
+                <w:szCs w:val="21"/>
+              </w:rPr>
+              <w:t xml:space="preserve">/cole.jpg</w:t>
+            </w:r>
+          </w:p>
+        </w:tc>
+      </w:tr>
+      <w:tr>
+        <w:tc>
+          <w:tcPr>
+            <w:tcW w:type="dxa" w:w="3100"/>
+            <w:tcMar>
+              <w:top w:type="dxa" w:w="80"/>
+              <w:left w:type="dxa" w:w="120"/>
+              <w:bottom w:type="dxa" w:w="80"/>
+              <w:right w:type="dxa" w:w="120"/>
+            </w:tcMar>
+          </w:tcPr>
+          <w:p>
+            <w:r>
+              <w:rPr>
+                <w:color w:val="555555"/>
+                <w:sz w:val="19"/>
+                <w:szCs w:val="19"/>
+              </w:rPr>
               <w:t xml:space="preserve">Photo caption</w:t>
             </w:r>
           </w:p>
@@ -1110,24 +1153,23 @@
         <w:tc>
           <w:tcPr>
             <w:tcW w:type="dxa" w:w="6260"/>
-            <w:shd w:fill="FFF3C4" w:val="clear"/>
-            <w:tcMar>
-              <w:top w:type="dxa" w:w="80"/>
-              <w:left w:type="dxa" w:w="120"/>
-              <w:bottom w:type="dxa" w:w="80"/>
-              <w:right w:type="dxa" w:w="120"/>
-            </w:tcMar>
-          </w:tcPr>
-          <w:p>
-            <w:r>
-              <w:rPr>
-                <w:b/>
-                <w:bCs/>
-                <w:color w:val="8A6100"/>
-                <w:sz w:val="21"/>
-                <w:szCs w:val="21"/>
-              </w:rPr>
-              <w:t xml:space="preserve">[FILL IN: age / year]</w:t>
+            <w:tcMar>
+              <w:top w:type="dxa" w:w="80"/>
+              <w:left w:type="dxa" w:w="120"/>
+              <w:bottom w:type="dxa" w:w="80"/>
+              <w:right w:type="dxa" w:w="120"/>
+            </w:tcMar>
+          </w:tcPr>
+          <w:p>
+            <w:r>
+              <w:rPr>
+                <w:b w:val="false"/>
+                <w:bCs w:val="false"/>
+                <w:color w:val="000000"/>
+                <w:sz w:val="21"/>
+                <w:szCs w:val="21"/>
+              </w:rPr>
+              <w:t xml:space="preserve">Age 11, 6th grade</w:t>
             </w:r>
           </w:p>
         </w:tc>
@@ -1203,24 +1245,23 @@
         <w:tc>
           <w:tcPr>
             <w:tcW w:type="dxa" w:w="6260"/>
-            <w:shd w:fill="FFF3C4" w:val="clear"/>
-            <w:tcMar>
-              <w:top w:type="dxa" w:w="80"/>
-              <w:left w:type="dxa" w:w="120"/>
-              <w:bottom w:type="dxa" w:w="80"/>
-              <w:right w:type="dxa" w:w="120"/>
-            </w:tcMar>
-          </w:tcPr>
-          <w:p>
-            <w:r>
-              <w:rPr>
-                <w:b/>
-                <w:bCs/>
-                <w:color w:val="8A6100"/>
-                <w:sz w:val="21"/>
-                <w:szCs w:val="21"/>
-              </w:rPr>
-              <w:t xml:space="preserve">[FILL IN: e.g. 11]</w:t>
+            <w:tcMar>
+              <w:top w:type="dxa" w:w="80"/>
+              <w:left w:type="dxa" w:w="120"/>
+              <w:bottom w:type="dxa" w:w="80"/>
+              <w:right w:type="dxa" w:w="120"/>
+            </w:tcMar>
+          </w:tcPr>
+          <w:p>
+            <w:r>
+              <w:rPr>
+                <w:b w:val="false"/>
+                <w:bCs w:val="false"/>
+                <w:color w:val="000000"/>
+                <w:sz w:val="21"/>
+                <w:szCs w:val="21"/>
+              </w:rPr>
+              <w:t xml:space="preserve">7</w:t>
             </w:r>
           </w:p>
         </w:tc>
@@ -1296,24 +1337,23 @@
         <w:tc>
           <w:tcPr>
             <w:tcW w:type="dxa" w:w="6260"/>
-            <w:shd w:fill="FFF3C4" w:val="clear"/>
-            <w:tcMar>
-              <w:top w:type="dxa" w:w="80"/>
-              <w:left w:type="dxa" w:w="120"/>
-              <w:bottom w:type="dxa" w:w="80"/>
-              <w:right w:type="dxa" w:w="120"/>
-            </w:tcMar>
-          </w:tcPr>
-          <w:p>
-            <w:r>
-              <w:rPr>
-                <w:b/>
-                <w:bCs/>
-                <w:color w:val="8A6100"/>
-                <w:sz w:val="21"/>
-                <w:szCs w:val="21"/>
-              </w:rPr>
-              <w:t xml:space="preserve">[FILL IN: e.g. 4,000]</w:t>
+            <w:tcMar>
+              <w:top w:type="dxa" w:w="80"/>
+              <w:left w:type="dxa" w:w="120"/>
+              <w:bottom w:type="dxa" w:w="80"/>
+              <w:right w:type="dxa" w:w="120"/>
+            </w:tcMar>
+          </w:tcPr>
+          <w:p>
+            <w:r>
+              <w:rPr>
+                <w:b w:val="false"/>
+                <w:bCs w:val="false"/>
+                <w:color w:val="000000"/>
+                <w:sz w:val="21"/>
+                <w:szCs w:val="21"/>
+              </w:rPr>
+              <w:t xml:space="preserve">4,200</w:t>
             </w:r>
           </w:p>
         </w:tc>
@@ -1371,7 +1411,7 @@
         <w:spacing w:after="140" w:before="320"/>
       </w:pPr>
       <w:r>
-        <w:t xml:space="preserve">Slide 04 — The origin story (photo wall)</w:t>
+        <w:t xml:space="preserve">Slide 04 — Origin story</w:t>
       </w:r>
     </w:p>
     <w:tbl>
@@ -2424,7 +2464,7 @@
         <w:spacing w:after="140" w:before="320"/>
       </w:pPr>
       <w:r>
-        <w:t xml:space="preserve">Slide 05 — Cole’s timeline</w:t>
+        <w:t xml:space="preserve">Slide 05 — Timeline</w:t>
       </w:r>
     </w:p>
     <w:tbl>
@@ -3725,7 +3765,7 @@
         <w:spacing w:after="140" w:before="320"/>
       </w:pPr>
       <w:r>
-        <w:t xml:space="preserve">Slide 06 — Big statement</w:t>
+        <w:t xml:space="preserve">Slide 06 — Hold on</w:t>
       </w:r>
     </w:p>
     <w:tbl>
@@ -4105,7 +4145,7 @@
           <w:sz w:val="18"/>
           <w:szCs w:val="18"/>
         </w:rPr>
-        <w:t xml:space="preserve">The list beside it shows all four chapter titles automatically.</w:t>
+        <w:t xml:space="preserve">The list beside it shows all 5 chapter titles automatically.</w:t>
       </w:r>
     </w:p>
     <w:p>
@@ -4114,7 +4154,7 @@
         <w:spacing w:after="140" w:before="320"/>
       </w:pPr>
       <w:r>
-        <w:t xml:space="preserve">Slide 08 — The 10,000-hour claim</w:t>
+        <w:t xml:space="preserve">Slide 08 — Outliers</w:t>
       </w:r>
     </w:p>
     <w:tbl>
@@ -4626,7 +4666,7 @@
         <w:spacing w:after="140" w:before="320"/>
       </w:pPr>
       <w:r>
-        <w:t xml:space="preserve">Slide 10 — Meet Tyler</w:t>
+        <w:t xml:space="preserve">Slide 10 — Tyler</w:t>
       </w:r>
     </w:p>
     <w:tbl>
@@ -5083,7 +5123,7 @@
         <w:spacing w:after="140" w:before="320"/>
       </w:pPr>
       <w:r>
-        <w:t xml:space="preserve">Slide 11 — Big statement</w:t>
+        <w:t xml:space="preserve">Slide 11 — Why?</w:t>
       </w:r>
     </w:p>
     <w:tbl>
@@ -5417,7 +5457,7 @@
           <w:sz w:val="18"/>
           <w:szCs w:val="18"/>
         </w:rPr>
-        <w:t xml:space="preserve">The list beside it shows all four chapter titles automatically.</w:t>
+        <w:t xml:space="preserve">The list beside it shows all 5 chapter titles automatically.</w:t>
       </w:r>
     </w:p>
     <w:p>
@@ -6096,7 +6136,7 @@
         <w:spacing w:after="140" w:before="320"/>
       </w:pPr>
       <w:r>
-        <w:t xml:space="preserve">Slide 14 — The question spiral</w:t>
+        <w:t xml:space="preserve">Slide 14 — The questions</w:t>
       </w:r>
     </w:p>
     <w:tbl>
@@ -7989,7 +8029,7 @@
           <w:sz w:val="18"/>
           <w:szCs w:val="18"/>
         </w:rPr>
-        <w:t xml:space="preserve">The list beside it shows all four chapter titles automatically.</w:t>
+        <w:t xml:space="preserve">The list beside it shows all 5 chapter titles automatically.</w:t>
       </w:r>
     </w:p>
     <w:p>
@@ -7998,7 +8038,7 @@
         <w:spacing w:after="140" w:before="320"/>
       </w:pPr>
       <w:r>
-        <w:t xml:space="preserve">Slide 17 — Cole’s takeaway</w:t>
+        <w:t xml:space="preserve">Slide 17 — Cole</w:t>
       </w:r>
     </w:p>
     <w:tbl>
@@ -8181,24 +8221,23 @@
         <w:tc>
           <w:tcPr>
             <w:tcW w:type="dxa" w:w="6260"/>
-            <w:shd w:fill="FFF3C4" w:val="clear"/>
-            <w:tcMar>
-              <w:top w:type="dxa" w:w="80"/>
-              <w:left w:type="dxa" w:w="120"/>
-              <w:bottom w:type="dxa" w:w="80"/>
-              <w:right w:type="dxa" w:w="120"/>
-            </w:tcMar>
-          </w:tcPr>
-          <w:p>
-            <w:r>
-              <w:rPr>
-                <w:b/>
-                <w:bCs/>
-                <w:color w:val="8A6100"/>
-                <w:sz w:val="21"/>
-                <w:szCs w:val="21"/>
-              </w:rPr>
-              <w:t xml:space="preserve">[FILL IN: Cole — full name]</w:t>
+            <w:tcMar>
+              <w:top w:type="dxa" w:w="80"/>
+              <w:left w:type="dxa" w:w="120"/>
+              <w:bottom w:type="dxa" w:w="80"/>
+              <w:right w:type="dxa" w:w="120"/>
+            </w:tcMar>
+          </w:tcPr>
+          <w:p>
+            <w:r>
+              <w:rPr>
+                <w:b w:val="false"/>
+                <w:bCs w:val="false"/>
+                <w:color w:val="000000"/>
+                <w:sz w:val="21"/>
+                <w:szCs w:val="21"/>
+              </w:rPr>
+              <w:t xml:space="preserve">Cole</w:t>
             </w:r>
           </w:p>
         </w:tc>
@@ -8210,7 +8249,7 @@
         <w:spacing w:after="140" w:before="320"/>
       </w:pPr>
       <w:r>
-        <w:t xml:space="preserve">Slide 18 — Closing</w:t>
+        <w:t xml:space="preserve">Slide 18 — Chapter V</w:t>
       </w:r>
     </w:p>
     <w:tbl>
@@ -8247,130 +8286,140 @@
                 <w:sz w:val="19"/>
                 <w:szCs w:val="19"/>
               </w:rPr>
-              <w:t xml:space="preserve">Line 1</w:t>
-            </w:r>
-          </w:p>
-        </w:tc>
-        <w:tc>
-          <w:tcPr>
-            <w:tcW w:type="dxa" w:w="6260"/>
-            <w:tcMar>
-              <w:top w:type="dxa" w:w="80"/>
-              <w:left w:type="dxa" w:w="120"/>
-              <w:bottom w:type="dxa" w:w="80"/>
-              <w:right w:type="dxa" w:w="120"/>
-            </w:tcMar>
-          </w:tcPr>
-          <w:p>
-            <w:r>
-              <w:rPr>
-                <w:b w:val="false"/>
-                <w:bCs w:val="false"/>
-                <w:color w:val="000000"/>
-                <w:sz w:val="21"/>
-                <w:szCs w:val="21"/>
-              </w:rPr>
-              <w:t xml:space="preserve">Hours are the</w:t>
-            </w:r>
-          </w:p>
-        </w:tc>
-      </w:tr>
-      <w:tr>
-        <w:tc>
-          <w:tcPr>
-            <w:tcW w:type="dxa" w:w="3100"/>
-            <w:tcMar>
-              <w:top w:type="dxa" w:w="80"/>
-              <w:left w:type="dxa" w:w="120"/>
-              <w:bottom w:type="dxa" w:w="80"/>
-              <w:right w:type="dxa" w:w="120"/>
-            </w:tcMar>
-          </w:tcPr>
-          <w:p>
-            <w:r>
-              <w:rPr>
-                <w:color w:val="555555"/>
-                <w:sz w:val="19"/>
-                <w:szCs w:val="19"/>
-              </w:rPr>
-              <w:t xml:space="preserve">Line 2</w:t>
-            </w:r>
-          </w:p>
-        </w:tc>
-        <w:tc>
-          <w:tcPr>
-            <w:tcW w:type="dxa" w:w="6260"/>
-            <w:tcMar>
-              <w:top w:type="dxa" w:w="80"/>
-              <w:left w:type="dxa" w:w="120"/>
-              <w:bottom w:type="dxa" w:w="80"/>
-              <w:right w:type="dxa" w:w="120"/>
-            </w:tcMar>
-          </w:tcPr>
-          <w:p>
-            <w:r>
-              <w:rPr>
-                <w:b w:val="false"/>
-                <w:bCs w:val="false"/>
-                <w:color w:val="000000"/>
-                <w:sz w:val="21"/>
-                <w:szCs w:val="21"/>
-              </w:rPr>
-              <w:t xml:space="preserve">container.</w:t>
-            </w:r>
-          </w:p>
-        </w:tc>
-      </w:tr>
-      <w:tr>
-        <w:tc>
-          <w:tcPr>
-            <w:tcW w:type="dxa" w:w="3100"/>
-            <w:tcMar>
-              <w:top w:type="dxa" w:w="80"/>
-              <w:left w:type="dxa" w:w="120"/>
-              <w:bottom w:type="dxa" w:w="80"/>
-              <w:right w:type="dxa" w:w="120"/>
-            </w:tcMar>
-          </w:tcPr>
-          <w:p>
-            <w:r>
-              <w:rPr>
-                <w:color w:val="555555"/>
-                <w:sz w:val="19"/>
-                <w:szCs w:val="19"/>
-              </w:rPr>
-              <w:t xml:space="preserve">Line 3 (green italic)</w:t>
-            </w:r>
-          </w:p>
-        </w:tc>
-        <w:tc>
-          <w:tcPr>
-            <w:tcW w:type="dxa" w:w="6260"/>
-            <w:tcMar>
-              <w:top w:type="dxa" w:w="80"/>
-              <w:left w:type="dxa" w:w="120"/>
-              <w:bottom w:type="dxa" w:w="80"/>
-              <w:right w:type="dxa" w:w="120"/>
-            </w:tcMar>
-          </w:tcPr>
-          <w:p>
-            <w:r>
-              <w:rPr>
-                <w:b w:val="false"/>
-                <w:bCs w:val="false"/>
-                <w:color w:val="000000"/>
-                <w:sz w:val="21"/>
-                <w:szCs w:val="21"/>
-              </w:rPr>
-              <w:t xml:space="preserve">You choose the content.</w:t>
+              <w:t xml:space="preserve">Chapter number</w:t>
+            </w:r>
+          </w:p>
+        </w:tc>
+        <w:tc>
+          <w:tcPr>
+            <w:tcW w:type="dxa" w:w="6260"/>
+            <w:tcMar>
+              <w:top w:type="dxa" w:w="80"/>
+              <w:left w:type="dxa" w:w="120"/>
+              <w:bottom w:type="dxa" w:w="80"/>
+              <w:right w:type="dxa" w:w="120"/>
+            </w:tcMar>
+          </w:tcPr>
+          <w:p>
+            <w:r>
+              <w:rPr>
+                <w:b w:val="false"/>
+                <w:bCs w:val="false"/>
+                <w:color w:val="000000"/>
+                <w:sz w:val="21"/>
+                <w:szCs w:val="21"/>
+              </w:rPr>
+              <w:t xml:space="preserve">V</w:t>
+            </w:r>
+          </w:p>
+        </w:tc>
+      </w:tr>
+      <w:tr>
+        <w:tc>
+          <w:tcPr>
+            <w:tcW w:type="dxa" w:w="3100"/>
+            <w:tcMar>
+              <w:top w:type="dxa" w:w="80"/>
+              <w:left w:type="dxa" w:w="120"/>
+              <w:bottom w:type="dxa" w:w="80"/>
+              <w:right w:type="dxa" w:w="120"/>
+            </w:tcMar>
+          </w:tcPr>
+          <w:p>
+            <w:r>
+              <w:rPr>
+                <w:color w:val="555555"/>
+                <w:sz w:val="19"/>
+                <w:szCs w:val="19"/>
+              </w:rPr>
+              <w:t xml:space="preserve">Chapter title</w:t>
+            </w:r>
+          </w:p>
+        </w:tc>
+        <w:tc>
+          <w:tcPr>
+            <w:tcW w:type="dxa" w:w="6260"/>
+            <w:tcMar>
+              <w:top w:type="dxa" w:w="80"/>
+              <w:left w:type="dxa" w:w="120"/>
+              <w:bottom w:type="dxa" w:w="80"/>
+              <w:right w:type="dxa" w:w="120"/>
+            </w:tcMar>
+          </w:tcPr>
+          <w:p>
+            <w:r>
+              <w:rPr>
+                <w:b w:val="false"/>
+                <w:bCs w:val="false"/>
+                <w:color w:val="000000"/>
+                <w:sz w:val="21"/>
+                <w:szCs w:val="21"/>
+              </w:rPr>
+              <w:t xml:space="preserve">The Application</w:t>
+            </w:r>
+          </w:p>
+        </w:tc>
+      </w:tr>
+      <w:tr>
+        <w:tc>
+          <w:tcPr>
+            <w:tcW w:type="dxa" w:w="3100"/>
+            <w:tcMar>
+              <w:top w:type="dxa" w:w="80"/>
+              <w:left w:type="dxa" w:w="120"/>
+              <w:bottom w:type="dxa" w:w="80"/>
+              <w:right w:type="dxa" w:w="120"/>
+            </w:tcMar>
+          </w:tcPr>
+          <w:p>
+            <w:r>
+              <w:rPr>
+                <w:color w:val="555555"/>
+                <w:sz w:val="19"/>
+                <w:szCs w:val="19"/>
+              </w:rPr>
+              <w:t xml:space="preserve">Chapter subtitle</w:t>
+            </w:r>
+          </w:p>
+        </w:tc>
+        <w:tc>
+          <w:tcPr>
+            <w:tcW w:type="dxa" w:w="6260"/>
+            <w:tcMar>
+              <w:top w:type="dxa" w:w="80"/>
+              <w:left w:type="dxa" w:w="120"/>
+              <w:bottom w:type="dxa" w:w="80"/>
+              <w:right w:type="dxa" w:w="120"/>
+            </w:tcMar>
+          </w:tcPr>
+          <w:p>
+            <w:r>
+              <w:rPr>
+                <w:b w:val="false"/>
+                <w:bCs w:val="false"/>
+                <w:color w:val="000000"/>
+                <w:sz w:val="21"/>
+                <w:szCs w:val="21"/>
+              </w:rPr>
+              <w:t xml:space="preserve">Where the argument has to go next</w:t>
             </w:r>
           </w:p>
         </w:tc>
       </w:tr>
     </w:tbl>
     <w:p>
+      <w:pPr>
+        <w:spacing w:after="120"/>
+      </w:pPr>
       <w:r>
-        <w:br w:type="page"/>
+        <w:rPr>
+          <w:i/>
+          <w:iCs/>
+          <w:color w:val="777777"/>
+          <w:sz w:val="18"/>
+          <w:szCs w:val="18"/>
+        </w:rPr>
+        <w:t xml:space="preserve">The list beside it shows all 5 chapter titles automatically.</w:t>
       </w:r>
     </w:p>
     <w:p>
@@ -8379,19 +8428,7 @@
         <w:spacing w:after="140" w:before="320"/>
       </w:pPr>
       <w:r>
-        <w:t xml:space="preserve">Slides that do not exist yet</w:t>
-      </w:r>
-    </w:p>
-    <w:p>
-      <w:pPr>
-        <w:spacing w:after="120"/>
-      </w:pPr>
-      <w:r>
-        <w:rPr>
-          <w:sz w:val="21"/>
-          <w:szCs w:val="21"/>
-        </w:rPr>
-        <w:t xml:space="preserve">The README checklist lists four sections. The deck covers Section 1. If the rubric wants the other three, sketch them here — rough notes are enough, they can be turned into real slides.</w:t>
+        <w:t xml:space="preserve">Slide 19 — Food security</w:t>
       </w:r>
     </w:p>
     <w:tbl>
@@ -8428,7 +8465,1934 @@
                 <w:sz w:val="19"/>
                 <w:szCs w:val="19"/>
               </w:rPr>
-              <w:t xml:space="preserve">Section 2 — “Developing Leadership Mindsets”: the connection</w:t>
+              <w:t xml:space="preserve">Label above headline</w:t>
+            </w:r>
+          </w:p>
+        </w:tc>
+        <w:tc>
+          <w:tcPr>
+            <w:tcW w:type="dxa" w:w="6260"/>
+            <w:tcMar>
+              <w:top w:type="dxa" w:w="80"/>
+              <w:left w:type="dxa" w:w="120"/>
+              <w:bottom w:type="dxa" w:w="80"/>
+              <w:right w:type="dxa" w:w="120"/>
+            </w:tcMar>
+          </w:tcPr>
+          <w:p>
+            <w:r>
+              <w:rPr>
+                <w:b w:val="false"/>
+                <w:bCs w:val="false"/>
+                <w:color w:val="000000"/>
+                <w:sz w:val="21"/>
+                <w:szCs w:val="21"/>
+              </w:rPr>
+              <w:t xml:space="preserve">Power of Food, applying the same argument</w:t>
+            </w:r>
+          </w:p>
+        </w:tc>
+      </w:tr>
+      <w:tr>
+        <w:tc>
+          <w:tcPr>
+            <w:tcW w:type="dxa" w:w="3100"/>
+            <w:tcMar>
+              <w:top w:type="dxa" w:w="80"/>
+              <w:left w:type="dxa" w:w="120"/>
+              <w:bottom w:type="dxa" w:w="80"/>
+              <w:right w:type="dxa" w:w="120"/>
+            </w:tcMar>
+          </w:tcPr>
+          <w:p>
+            <w:r>
+              <w:rPr>
+                <w:color w:val="555555"/>
+                <w:sz w:val="19"/>
+                <w:szCs w:val="19"/>
+              </w:rPr>
+              <w:t xml:space="preserve">Headline</w:t>
+            </w:r>
+          </w:p>
+        </w:tc>
+        <w:tc>
+          <w:tcPr>
+            <w:tcW w:type="dxa" w:w="6260"/>
+            <w:tcMar>
+              <w:top w:type="dxa" w:w="80"/>
+              <w:left w:type="dxa" w:w="120"/>
+              <w:bottom w:type="dxa" w:w="80"/>
+              <w:right w:type="dxa" w:w="120"/>
+            </w:tcMar>
+          </w:tcPr>
+          <w:p>
+            <w:r>
+              <w:rPr>
+                <w:b w:val="false"/>
+                <w:bCs w:val="false"/>
+                <w:color w:val="000000"/>
+                <w:sz w:val="21"/>
+                <w:szCs w:val="21"/>
+              </w:rPr>
+              <w:t xml:space="preserve">Every gate has a name. None of them are willpower.</w:t>
+            </w:r>
+          </w:p>
+        </w:tc>
+      </w:tr>
+      <w:tr>
+        <w:tc>
+          <w:tcPr>
+            <w:tcW w:type="dxa" w:w="3100"/>
+            <w:tcMar>
+              <w:top w:type="dxa" w:w="80"/>
+              <w:left w:type="dxa" w:w="120"/>
+              <w:bottom w:type="dxa" w:w="80"/>
+              <w:right w:type="dxa" w:w="120"/>
+            </w:tcMar>
+          </w:tcPr>
+          <w:p>
+            <w:r>
+              <w:rPr>
+                <w:color w:val="555555"/>
+                <w:sz w:val="19"/>
+                <w:szCs w:val="19"/>
+              </w:rPr>
+              <w:t xml:space="preserve">Cost 1 question</w:t>
+            </w:r>
+          </w:p>
+        </w:tc>
+        <w:tc>
+          <w:tcPr>
+            <w:tcW w:type="dxa" w:w="6260"/>
+            <w:tcMar>
+              <w:top w:type="dxa" w:w="80"/>
+              <w:left w:type="dxa" w:w="120"/>
+              <w:bottom w:type="dxa" w:w="80"/>
+              <w:right w:type="dxa" w:w="120"/>
+            </w:tcMar>
+          </w:tcPr>
+          <w:p>
+            <w:r>
+              <w:rPr>
+                <w:b w:val="false"/>
+                <w:bCs w:val="false"/>
+                <w:color w:val="000000"/>
+                <w:sz w:val="21"/>
+                <w:szCs w:val="21"/>
+              </w:rPr>
+              <w:t xml:space="preserve">A grocery store nearby?</w:t>
+            </w:r>
+          </w:p>
+        </w:tc>
+      </w:tr>
+      <w:tr>
+        <w:tc>
+          <w:tcPr>
+            <w:tcW w:type="dxa" w:w="3100"/>
+            <w:tcMar>
+              <w:top w:type="dxa" w:w="80"/>
+              <w:left w:type="dxa" w:w="120"/>
+              <w:bottom w:type="dxa" w:w="80"/>
+              <w:right w:type="dxa" w:w="120"/>
+            </w:tcMar>
+          </w:tcPr>
+          <w:p>
+            <w:r>
+              <w:rPr>
+                <w:color w:val="555555"/>
+                <w:sz w:val="19"/>
+                <w:szCs w:val="19"/>
+              </w:rPr>
+              <w:t xml:space="preserve">Cost 1 price</w:t>
+            </w:r>
+          </w:p>
+        </w:tc>
+        <w:tc>
+          <w:tcPr>
+            <w:tcW w:type="dxa" w:w="6260"/>
+            <w:tcMar>
+              <w:top w:type="dxa" w:w="80"/>
+              <w:left w:type="dxa" w:w="120"/>
+              <w:bottom w:type="dxa" w:w="80"/>
+              <w:right w:type="dxa" w:w="120"/>
+            </w:tcMar>
+          </w:tcPr>
+          <w:p>
+            <w:r>
+              <w:rPr>
+                <w:b w:val="false"/>
+                <w:bCs w:val="false"/>
+                <w:color w:val="000000"/>
+                <w:sz w:val="21"/>
+                <w:szCs w:val="21"/>
+              </w:rPr>
+              <w:t xml:space="preserve">Miles, not minutes</w:t>
+            </w:r>
+          </w:p>
+        </w:tc>
+      </w:tr>
+      <w:tr>
+        <w:tc>
+          <w:tcPr>
+            <w:tcW w:type="dxa" w:w="3100"/>
+            <w:tcMar>
+              <w:top w:type="dxa" w:w="80"/>
+              <w:left w:type="dxa" w:w="120"/>
+              <w:bottom w:type="dxa" w:w="80"/>
+              <w:right w:type="dxa" w:w="120"/>
+            </w:tcMar>
+          </w:tcPr>
+          <w:p>
+            <w:r>
+              <w:rPr>
+                <w:color w:val="555555"/>
+                <w:sz w:val="19"/>
+                <w:szCs w:val="19"/>
+              </w:rPr>
+              <w:t xml:space="preserve">Cost 2 question</w:t>
+            </w:r>
+          </w:p>
+        </w:tc>
+        <w:tc>
+          <w:tcPr>
+            <w:tcW w:type="dxa" w:w="6260"/>
+            <w:tcMar>
+              <w:top w:type="dxa" w:w="80"/>
+              <w:left w:type="dxa" w:w="120"/>
+              <w:bottom w:type="dxa" w:w="80"/>
+              <w:right w:type="dxa" w:w="120"/>
+            </w:tcMar>
+          </w:tcPr>
+          <w:p>
+            <w:r>
+              <w:rPr>
+                <w:b w:val="false"/>
+                <w:bCs w:val="false"/>
+                <w:color w:val="000000"/>
+                <w:sz w:val="21"/>
+                <w:szCs w:val="21"/>
+              </w:rPr>
+              <w:t xml:space="preserve">Time to cook after two jobs?</w:t>
+            </w:r>
+          </w:p>
+        </w:tc>
+      </w:tr>
+      <w:tr>
+        <w:tc>
+          <w:tcPr>
+            <w:tcW w:type="dxa" w:w="3100"/>
+            <w:tcMar>
+              <w:top w:type="dxa" w:w="80"/>
+              <w:left w:type="dxa" w:w="120"/>
+              <w:bottom w:type="dxa" w:w="80"/>
+              <w:right w:type="dxa" w:w="120"/>
+            </w:tcMar>
+          </w:tcPr>
+          <w:p>
+            <w:r>
+              <w:rPr>
+                <w:color w:val="555555"/>
+                <w:sz w:val="19"/>
+                <w:szCs w:val="19"/>
+              </w:rPr>
+              <w:t xml:space="preserve">Cost 2 price</w:t>
+            </w:r>
+          </w:p>
+        </w:tc>
+        <w:tc>
+          <w:tcPr>
+            <w:tcW w:type="dxa" w:w="6260"/>
+            <w:tcMar>
+              <w:top w:type="dxa" w:w="80"/>
+              <w:left w:type="dxa" w:w="120"/>
+              <w:bottom w:type="dxa" w:w="80"/>
+              <w:right w:type="dxa" w:w="120"/>
+            </w:tcMar>
+          </w:tcPr>
+          <w:p>
+            <w:r>
+              <w:rPr>
+                <w:b w:val="false"/>
+                <w:bCs w:val="false"/>
+                <w:color w:val="000000"/>
+                <w:sz w:val="21"/>
+                <w:szCs w:val="21"/>
+              </w:rPr>
+              <w:t xml:space="preserve">Rarely any</w:t>
+            </w:r>
+          </w:p>
+        </w:tc>
+      </w:tr>
+      <w:tr>
+        <w:tc>
+          <w:tcPr>
+            <w:tcW w:type="dxa" w:w="3100"/>
+            <w:tcMar>
+              <w:top w:type="dxa" w:w="80"/>
+              <w:left w:type="dxa" w:w="120"/>
+              <w:bottom w:type="dxa" w:w="80"/>
+              <w:right w:type="dxa" w:w="120"/>
+            </w:tcMar>
+          </w:tcPr>
+          <w:p>
+            <w:r>
+              <w:rPr>
+                <w:color w:val="555555"/>
+                <w:sz w:val="19"/>
+                <w:szCs w:val="19"/>
+              </w:rPr>
+              <w:t xml:space="preserve">Cost 3 question</w:t>
+            </w:r>
+          </w:p>
+        </w:tc>
+        <w:tc>
+          <w:tcPr>
+            <w:tcW w:type="dxa" w:w="6260"/>
+            <w:tcMar>
+              <w:top w:type="dxa" w:w="80"/>
+              <w:left w:type="dxa" w:w="120"/>
+              <w:bottom w:type="dxa" w:w="80"/>
+              <w:right w:type="dxa" w:w="120"/>
+            </w:tcMar>
+          </w:tcPr>
+          <w:p>
+            <w:r>
+              <w:rPr>
+                <w:b w:val="false"/>
+                <w:bCs w:val="false"/>
+                <w:color w:val="000000"/>
+                <w:sz w:val="21"/>
+                <w:szCs w:val="21"/>
+              </w:rPr>
+              <w:t xml:space="preserve">Money for the version that is not packaged?</w:t>
+            </w:r>
+          </w:p>
+        </w:tc>
+      </w:tr>
+      <w:tr>
+        <w:tc>
+          <w:tcPr>
+            <w:tcW w:type="dxa" w:w="3100"/>
+            <w:tcMar>
+              <w:top w:type="dxa" w:w="80"/>
+              <w:left w:type="dxa" w:w="120"/>
+              <w:bottom w:type="dxa" w:w="80"/>
+              <w:right w:type="dxa" w:w="120"/>
+            </w:tcMar>
+          </w:tcPr>
+          <w:p>
+            <w:r>
+              <w:rPr>
+                <w:color w:val="555555"/>
+                <w:sz w:val="19"/>
+                <w:szCs w:val="19"/>
+              </w:rPr>
+              <w:t xml:space="preserve">Cost 3 price</w:t>
+            </w:r>
+          </w:p>
+        </w:tc>
+        <w:tc>
+          <w:tcPr>
+            <w:tcW w:type="dxa" w:w="6260"/>
+            <w:tcMar>
+              <w:top w:type="dxa" w:w="80"/>
+              <w:left w:type="dxa" w:w="120"/>
+              <w:bottom w:type="dxa" w:w="80"/>
+              <w:right w:type="dxa" w:w="120"/>
+            </w:tcMar>
+          </w:tcPr>
+          <w:p>
+            <w:r>
+              <w:rPr>
+                <w:b w:val="false"/>
+                <w:bCs w:val="false"/>
+                <w:color w:val="000000"/>
+                <w:sz w:val="21"/>
+                <w:szCs w:val="21"/>
+              </w:rPr>
+              <w:t xml:space="preserve">Priced like a luxury</w:t>
+            </w:r>
+          </w:p>
+        </w:tc>
+      </w:tr>
+      <w:tr>
+        <w:tc>
+          <w:tcPr>
+            <w:tcW w:type="dxa" w:w="3100"/>
+            <w:tcMar>
+              <w:top w:type="dxa" w:w="80"/>
+              <w:left w:type="dxa" w:w="120"/>
+              <w:bottom w:type="dxa" w:w="80"/>
+              <w:right w:type="dxa" w:w="120"/>
+            </w:tcMar>
+          </w:tcPr>
+          <w:p>
+            <w:r>
+              <w:rPr>
+                <w:color w:val="555555"/>
+                <w:sz w:val="19"/>
+                <w:szCs w:val="19"/>
+              </w:rPr>
+              <w:t xml:space="preserve">Cost 4 question</w:t>
+            </w:r>
+          </w:p>
+        </w:tc>
+        <w:tc>
+          <w:tcPr>
+            <w:tcW w:type="dxa" w:w="6260"/>
+            <w:tcMar>
+              <w:top w:type="dxa" w:w="80"/>
+              <w:left w:type="dxa" w:w="120"/>
+              <w:bottom w:type="dxa" w:w="80"/>
+              <w:right w:type="dxa" w:w="120"/>
+            </w:tcMar>
+          </w:tcPr>
+          <w:p>
+            <w:r>
+              <w:rPr>
+                <w:b w:val="false"/>
+                <w:bCs w:val="false"/>
+                <w:color w:val="000000"/>
+                <w:sz w:val="21"/>
+                <w:szCs w:val="21"/>
+              </w:rPr>
+              <w:t xml:space="preserve">A kitchen that actually works?</w:t>
+            </w:r>
+          </w:p>
+        </w:tc>
+      </w:tr>
+      <w:tr>
+        <w:tc>
+          <w:tcPr>
+            <w:tcW w:type="dxa" w:w="3100"/>
+            <w:tcMar>
+              <w:top w:type="dxa" w:w="80"/>
+              <w:left w:type="dxa" w:w="120"/>
+              <w:bottom w:type="dxa" w:w="80"/>
+              <w:right w:type="dxa" w:w="120"/>
+            </w:tcMar>
+          </w:tcPr>
+          <w:p>
+            <w:r>
+              <w:rPr>
+                <w:color w:val="555555"/>
+                <w:sz w:val="19"/>
+                <w:szCs w:val="19"/>
+              </w:rPr>
+              <w:t xml:space="preserve">Cost 4 price</w:t>
+            </w:r>
+          </w:p>
+        </w:tc>
+        <w:tc>
+          <w:tcPr>
+            <w:tcW w:type="dxa" w:w="6260"/>
+            <w:tcMar>
+              <w:top w:type="dxa" w:w="80"/>
+              <w:left w:type="dxa" w:w="120"/>
+              <w:bottom w:type="dxa" w:w="80"/>
+              <w:right w:type="dxa" w:w="120"/>
+            </w:tcMar>
+          </w:tcPr>
+          <w:p>
+            <w:r>
+              <w:rPr>
+                <w:b w:val="false"/>
+                <w:bCs w:val="false"/>
+                <w:color w:val="000000"/>
+                <w:sz w:val="21"/>
+                <w:szCs w:val="21"/>
+              </w:rPr>
+              <w:t xml:space="preserve">Not guaranteed</w:t>
+            </w:r>
+          </w:p>
+        </w:tc>
+      </w:tr>
+      <w:tr>
+        <w:tc>
+          <w:tcPr>
+            <w:tcW w:type="dxa" w:w="3100"/>
+            <w:tcMar>
+              <w:top w:type="dxa" w:w="80"/>
+              <w:left w:type="dxa" w:w="120"/>
+              <w:bottom w:type="dxa" w:w="80"/>
+              <w:right w:type="dxa" w:w="120"/>
+            </w:tcMar>
+          </w:tcPr>
+          <w:p>
+            <w:r>
+              <w:rPr>
+                <w:color w:val="555555"/>
+                <w:sz w:val="19"/>
+                <w:szCs w:val="19"/>
+              </w:rPr>
+              <w:t xml:space="preserve">Cost 5 question</w:t>
+            </w:r>
+          </w:p>
+        </w:tc>
+        <w:tc>
+          <w:tcPr>
+            <w:tcW w:type="dxa" w:w="6260"/>
+            <w:tcMar>
+              <w:top w:type="dxa" w:w="80"/>
+              <w:left w:type="dxa" w:w="120"/>
+              <w:bottom w:type="dxa" w:w="80"/>
+              <w:right w:type="dxa" w:w="120"/>
+            </w:tcMar>
+          </w:tcPr>
+          <w:p>
+            <w:r>
+              <w:rPr>
+                <w:b w:val="false"/>
+                <w:bCs w:val="false"/>
+                <w:color w:val="000000"/>
+                <w:sz w:val="21"/>
+                <w:szCs w:val="21"/>
+              </w:rPr>
+              <w:t xml:space="preserve">Someone who already knows how to cook it?</w:t>
+            </w:r>
+          </w:p>
+        </w:tc>
+      </w:tr>
+      <w:tr>
+        <w:tc>
+          <w:tcPr>
+            <w:tcW w:type="dxa" w:w="3100"/>
+            <w:tcMar>
+              <w:top w:type="dxa" w:w="80"/>
+              <w:left w:type="dxa" w:w="120"/>
+              <w:bottom w:type="dxa" w:w="80"/>
+              <w:right w:type="dxa" w:w="120"/>
+            </w:tcMar>
+          </w:tcPr>
+          <w:p>
+            <w:r>
+              <w:rPr>
+                <w:color w:val="555555"/>
+                <w:sz w:val="19"/>
+                <w:szCs w:val="19"/>
+              </w:rPr>
+              <w:t xml:space="preserve">Cost 5 price</w:t>
+            </w:r>
+          </w:p>
+        </w:tc>
+        <w:tc>
+          <w:tcPr>
+            <w:tcW w:type="dxa" w:w="6260"/>
+            <w:tcMar>
+              <w:top w:type="dxa" w:w="80"/>
+              <w:left w:type="dxa" w:w="120"/>
+              <w:bottom w:type="dxa" w:w="80"/>
+              <w:right w:type="dxa" w:w="120"/>
+            </w:tcMar>
+          </w:tcPr>
+          <w:p>
+            <w:r>
+              <w:rPr>
+                <w:b w:val="false"/>
+                <w:bCs w:val="false"/>
+                <w:color w:val="000000"/>
+                <w:sz w:val="21"/>
+                <w:szCs w:val="21"/>
+              </w:rPr>
+              <w:t xml:space="preserve">Depends who raised you</w:t>
+            </w:r>
+          </w:p>
+        </w:tc>
+      </w:tr>
+      <w:tr>
+        <w:tc>
+          <w:tcPr>
+            <w:tcW w:type="dxa" w:w="3100"/>
+            <w:tcMar>
+              <w:top w:type="dxa" w:w="80"/>
+              <w:left w:type="dxa" w:w="120"/>
+              <w:bottom w:type="dxa" w:w="80"/>
+              <w:right w:type="dxa" w:w="120"/>
+            </w:tcMar>
+          </w:tcPr>
+          <w:p>
+            <w:r>
+              <w:rPr>
+                <w:color w:val="555555"/>
+                <w:sz w:val="19"/>
+                <w:szCs w:val="19"/>
+              </w:rPr>
+              <w:t xml:space="preserve">Cost 6 question</w:t>
+            </w:r>
+          </w:p>
+        </w:tc>
+        <w:tc>
+          <w:tcPr>
+            <w:tcW w:type="dxa" w:w="6260"/>
+            <w:tcMar>
+              <w:top w:type="dxa" w:w="80"/>
+              <w:left w:type="dxa" w:w="120"/>
+              <w:bottom w:type="dxa" w:w="80"/>
+              <w:right w:type="dxa" w:w="120"/>
+            </w:tcMar>
+          </w:tcPr>
+          <w:p>
+            <w:r>
+              <w:rPr>
+                <w:b w:val="false"/>
+                <w:bCs w:val="false"/>
+                <w:color w:val="000000"/>
+                <w:sz w:val="21"/>
+                <w:szCs w:val="21"/>
+              </w:rPr>
+              <w:t xml:space="preserve">A ride to get there at all?</w:t>
+            </w:r>
+          </w:p>
+        </w:tc>
+      </w:tr>
+      <w:tr>
+        <w:tc>
+          <w:tcPr>
+            <w:tcW w:type="dxa" w:w="3100"/>
+            <w:tcMar>
+              <w:top w:type="dxa" w:w="80"/>
+              <w:left w:type="dxa" w:w="120"/>
+              <w:bottom w:type="dxa" w:w="80"/>
+              <w:right w:type="dxa" w:w="120"/>
+            </w:tcMar>
+          </w:tcPr>
+          <w:p>
+            <w:r>
+              <w:rPr>
+                <w:color w:val="555555"/>
+                <w:sz w:val="19"/>
+                <w:szCs w:val="19"/>
+              </w:rPr>
+              <w:t xml:space="preserve">Cost 6 price</w:t>
+            </w:r>
+          </w:p>
+        </w:tc>
+        <w:tc>
+          <w:tcPr>
+            <w:tcW w:type="dxa" w:w="6260"/>
+            <w:tcMar>
+              <w:top w:type="dxa" w:w="80"/>
+              <w:left w:type="dxa" w:w="120"/>
+              <w:bottom w:type="dxa" w:w="80"/>
+              <w:right w:type="dxa" w:w="120"/>
+            </w:tcMar>
+          </w:tcPr>
+          <w:p>
+            <w:r>
+              <w:rPr>
+                <w:b w:val="false"/>
+                <w:bCs w:val="false"/>
+                <w:color w:val="000000"/>
+                <w:sz w:val="21"/>
+                <w:szCs w:val="21"/>
+              </w:rPr>
+              <w:t xml:space="preserve">Not everyone has one</w:t>
+            </w:r>
+          </w:p>
+        </w:tc>
+      </w:tr>
+      <w:tr>
+        <w:tc>
+          <w:tcPr>
+            <w:tcW w:type="dxa" w:w="3100"/>
+            <w:tcMar>
+              <w:top w:type="dxa" w:w="80"/>
+              <w:left w:type="dxa" w:w="120"/>
+              <w:bottom w:type="dxa" w:w="80"/>
+              <w:right w:type="dxa" w:w="120"/>
+            </w:tcMar>
+          </w:tcPr>
+          <w:p>
+            <w:r>
+              <w:rPr>
+                <w:color w:val="555555"/>
+                <w:sz w:val="19"/>
+                <w:szCs w:val="19"/>
+              </w:rPr>
+              <w:t xml:space="preserve">Paragraph beside the costs</w:t>
+            </w:r>
+          </w:p>
+        </w:tc>
+        <w:tc>
+          <w:tcPr>
+            <w:tcW w:type="dxa" w:w="6260"/>
+            <w:tcMar>
+              <w:top w:type="dxa" w:w="80"/>
+              <w:left w:type="dxa" w:w="120"/>
+              <w:bottom w:type="dxa" w:w="80"/>
+              <w:right w:type="dxa" w:w="120"/>
+            </w:tcMar>
+          </w:tcPr>
+          <w:p>
+            <w:r>
+              <w:rPr>
+                <w:b w:val="false"/>
+                <w:bCs w:val="false"/>
+                <w:color w:val="000000"/>
+                <w:sz w:val="21"/>
+                <w:szCs w:val="21"/>
+              </w:rPr>
+              <w:t xml:space="preserve">Nobody eats badly because they lack willpower any more than Tyler lacked hours. The same gates that decided who got to be great decide who gets to eat well: proximity, time, money, and someone who already knows how. Leadership here does not mean telling people to try harder. It means opening a gate.</w:t>
+            </w:r>
+          </w:p>
+        </w:tc>
+      </w:tr>
+      <w:tr>
+        <w:tc>
+          <w:tcPr>
+            <w:tcW w:type="dxa" w:w="3100"/>
+            <w:tcMar>
+              <w:top w:type="dxa" w:w="80"/>
+              <w:left w:type="dxa" w:w="120"/>
+              <w:bottom w:type="dxa" w:w="80"/>
+              <w:right w:type="dxa" w:w="120"/>
+            </w:tcMar>
+          </w:tcPr>
+          <w:p>
+            <w:r>
+              <w:rPr>
+                <w:color w:val="555555"/>
+                <w:sz w:val="19"/>
+                <w:szCs w:val="19"/>
+              </w:rPr>
+              <w:t xml:space="preserve">Example 1 who</w:t>
+            </w:r>
+          </w:p>
+        </w:tc>
+        <w:tc>
+          <w:tcPr>
+            <w:tcW w:type="dxa" w:w="6260"/>
+            <w:tcMar>
+              <w:top w:type="dxa" w:w="80"/>
+              <w:left w:type="dxa" w:w="120"/>
+              <w:bottom w:type="dxa" w:w="80"/>
+              <w:right w:type="dxa" w:w="120"/>
+            </w:tcMar>
+          </w:tcPr>
+          <w:p>
+            <w:r>
+              <w:rPr>
+                <w:b w:val="false"/>
+                <w:bCs w:val="false"/>
+                <w:color w:val="000000"/>
+                <w:sz w:val="21"/>
+                <w:szCs w:val="21"/>
+              </w:rPr>
+              <w:t xml:space="preserve">A ride</w:t>
+            </w:r>
+          </w:p>
+        </w:tc>
+      </w:tr>
+      <w:tr>
+        <w:tc>
+          <w:tcPr>
+            <w:tcW w:type="dxa" w:w="3100"/>
+            <w:tcMar>
+              <w:top w:type="dxa" w:w="80"/>
+              <w:left w:type="dxa" w:w="120"/>
+              <w:bottom w:type="dxa" w:w="80"/>
+              <w:right w:type="dxa" w:w="120"/>
+            </w:tcMar>
+          </w:tcPr>
+          <w:p>
+            <w:r>
+              <w:rPr>
+                <w:color w:val="555555"/>
+                <w:sz w:val="19"/>
+                <w:szCs w:val="19"/>
+              </w:rPr>
+              <w:t xml:space="preserve">Example 1 what</w:t>
+            </w:r>
+          </w:p>
+        </w:tc>
+        <w:tc>
+          <w:tcPr>
+            <w:tcW w:type="dxa" w:w="6260"/>
+            <w:tcMar>
+              <w:top w:type="dxa" w:w="80"/>
+              <w:left w:type="dxa" w:w="120"/>
+              <w:bottom w:type="dxa" w:w="80"/>
+              <w:right w:type="dxa" w:w="120"/>
+            </w:tcMar>
+          </w:tcPr>
+          <w:p>
+            <w:r>
+              <w:rPr>
+                <w:b w:val="false"/>
+                <w:bCs w:val="false"/>
+                <w:color w:val="000000"/>
+                <w:sz w:val="21"/>
+                <w:szCs w:val="21"/>
+              </w:rPr>
+              <w:t xml:space="preserve">A community shuttle to the grocery store on pantry days</w:t>
+            </w:r>
+          </w:p>
+        </w:tc>
+      </w:tr>
+      <w:tr>
+        <w:tc>
+          <w:tcPr>
+            <w:tcW w:type="dxa" w:w="3100"/>
+            <w:tcMar>
+              <w:top w:type="dxa" w:w="80"/>
+              <w:left w:type="dxa" w:w="120"/>
+              <w:bottom w:type="dxa" w:w="80"/>
+              <w:right w:type="dxa" w:w="120"/>
+            </w:tcMar>
+          </w:tcPr>
+          <w:p>
+            <w:r>
+              <w:rPr>
+                <w:color w:val="555555"/>
+                <w:sz w:val="19"/>
+                <w:szCs w:val="19"/>
+              </w:rPr>
+              <w:t xml:space="preserve">Example 2 who</w:t>
+            </w:r>
+          </w:p>
+        </w:tc>
+        <w:tc>
+          <w:tcPr>
+            <w:tcW w:type="dxa" w:w="6260"/>
+            <w:tcMar>
+              <w:top w:type="dxa" w:w="80"/>
+              <w:left w:type="dxa" w:w="120"/>
+              <w:bottom w:type="dxa" w:w="80"/>
+              <w:right w:type="dxa" w:w="120"/>
+            </w:tcMar>
+          </w:tcPr>
+          <w:p>
+            <w:r>
+              <w:rPr>
+                <w:b w:val="false"/>
+                <w:bCs w:val="false"/>
+                <w:color w:val="000000"/>
+                <w:sz w:val="21"/>
+                <w:szCs w:val="21"/>
+              </w:rPr>
+              <w:t xml:space="preserve">A recipe</w:t>
+            </w:r>
+          </w:p>
+        </w:tc>
+      </w:tr>
+      <w:tr>
+        <w:tc>
+          <w:tcPr>
+            <w:tcW w:type="dxa" w:w="3100"/>
+            <w:tcMar>
+              <w:top w:type="dxa" w:w="80"/>
+              <w:left w:type="dxa" w:w="120"/>
+              <w:bottom w:type="dxa" w:w="80"/>
+              <w:right w:type="dxa" w:w="120"/>
+            </w:tcMar>
+          </w:tcPr>
+          <w:p>
+            <w:r>
+              <w:rPr>
+                <w:color w:val="555555"/>
+                <w:sz w:val="19"/>
+                <w:szCs w:val="19"/>
+              </w:rPr>
+              <w:t xml:space="preserve">Example 2 what</w:t>
+            </w:r>
+          </w:p>
+        </w:tc>
+        <w:tc>
+          <w:tcPr>
+            <w:tcW w:type="dxa" w:w="6260"/>
+            <w:tcMar>
+              <w:top w:type="dxa" w:w="80"/>
+              <w:left w:type="dxa" w:w="120"/>
+              <w:bottom w:type="dxa" w:w="80"/>
+              <w:right w:type="dxa" w:w="120"/>
+            </w:tcMar>
+          </w:tcPr>
+          <w:p>
+            <w:r>
+              <w:rPr>
+                <w:b w:val="false"/>
+                <w:bCs w:val="false"/>
+                <w:color w:val="000000"/>
+                <w:sz w:val="21"/>
+                <w:szCs w:val="21"/>
+              </w:rPr>
+              <w:t xml:space="preserve">A thirty minute recipe card that assumes two jobs and one pan</w:t>
+            </w:r>
+          </w:p>
+        </w:tc>
+      </w:tr>
+      <w:tr>
+        <w:tc>
+          <w:tcPr>
+            <w:tcW w:type="dxa" w:w="3100"/>
+            <w:tcMar>
+              <w:top w:type="dxa" w:w="80"/>
+              <w:left w:type="dxa" w:w="120"/>
+              <w:bottom w:type="dxa" w:w="80"/>
+              <w:right w:type="dxa" w:w="120"/>
+            </w:tcMar>
+          </w:tcPr>
+          <w:p>
+            <w:r>
+              <w:rPr>
+                <w:color w:val="555555"/>
+                <w:sz w:val="19"/>
+                <w:szCs w:val="19"/>
+              </w:rPr>
+              <w:t xml:space="preserve">Closing line</w:t>
+            </w:r>
+          </w:p>
+        </w:tc>
+        <w:tc>
+          <w:tcPr>
+            <w:tcW w:type="dxa" w:w="6260"/>
+            <w:tcMar>
+              <w:top w:type="dxa" w:w="80"/>
+              <w:left w:type="dxa" w:w="120"/>
+              <w:bottom w:type="dxa" w:w="80"/>
+              <w:right w:type="dxa" w:w="120"/>
+            </w:tcMar>
+          </w:tcPr>
+          <w:p>
+            <w:r>
+              <w:rPr>
+                <w:b w:val="false"/>
+                <w:bCs w:val="false"/>
+                <w:color w:val="000000"/>
+                <w:sz w:val="21"/>
+                <w:szCs w:val="21"/>
+              </w:rPr>
+              <w:t xml:space="preserve">Obsession made Cole a musician. Access decides who gets to eat.</w:t>
+            </w:r>
+          </w:p>
+        </w:tc>
+      </w:tr>
+    </w:tbl>
+    <w:p>
+      <w:pPr>
+        <w:pStyle w:val="Heading1"/>
+        <w:spacing w:after="140" w:before="320"/>
+      </w:pPr>
+      <w:r>
+        <w:t xml:space="preserve">Slide 20 — Our brand</w:t>
+      </w:r>
+    </w:p>
+    <w:tbl>
+      <w:tblPr>
+        <w:tblW w:type="dxa" w:w="9360"/>
+        <w:tblBorders>
+          <w:top w:val="single" w:color="D8D4CA" w:sz="2"/>
+          <w:left w:val="single" w:color="D8D4CA" w:sz="2"/>
+          <w:bottom w:val="single" w:color="D8D4CA" w:sz="2"/>
+          <w:right w:val="single" w:color="D8D4CA" w:sz="2"/>
+          <w:insideH w:val="single" w:color="E8E5DD" w:sz="2"/>
+          <w:insideV w:val="single" w:color="E8E5DD" w:sz="2"/>
+        </w:tblBorders>
+      </w:tblPr>
+      <w:tblGrid>
+        <w:gridCol w:w="3100"/>
+        <w:gridCol w:w="6260"/>
+      </w:tblGrid>
+      <w:tr>
+        <w:tc>
+          <w:tcPr>
+            <w:tcW w:type="dxa" w:w="3100"/>
+            <w:tcMar>
+              <w:top w:type="dxa" w:w="80"/>
+              <w:left w:type="dxa" w:w="120"/>
+              <w:bottom w:type="dxa" w:w="80"/>
+              <w:right w:type="dxa" w:w="120"/>
+            </w:tcMar>
+          </w:tcPr>
+          <w:p>
+            <w:r>
+              <w:rPr>
+                <w:color w:val="555555"/>
+                <w:sz w:val="19"/>
+                <w:szCs w:val="19"/>
+              </w:rPr>
+              <w:t xml:space="preserve">Label at the top</w:t>
+            </w:r>
+          </w:p>
+        </w:tc>
+        <w:tc>
+          <w:tcPr>
+            <w:tcW w:type="dxa" w:w="6260"/>
+            <w:tcMar>
+              <w:top w:type="dxa" w:w="80"/>
+              <w:left w:type="dxa" w:w="120"/>
+              <w:bottom w:type="dxa" w:w="80"/>
+              <w:right w:type="dxa" w:w="120"/>
+            </w:tcMar>
+          </w:tcPr>
+          <w:p>
+            <w:r>
+              <w:rPr>
+                <w:b w:val="false"/>
+                <w:bCs w:val="false"/>
+                <w:color w:val="000000"/>
+                <w:sz w:val="21"/>
+                <w:szCs w:val="21"/>
+              </w:rPr>
+              <w:t xml:space="preserve">Section 4 — professional brand</w:t>
+            </w:r>
+          </w:p>
+        </w:tc>
+      </w:tr>
+      <w:tr>
+        <w:tc>
+          <w:tcPr>
+            <w:tcW w:type="dxa" w:w="3100"/>
+            <w:tcMar>
+              <w:top w:type="dxa" w:w="80"/>
+              <w:left w:type="dxa" w:w="120"/>
+              <w:bottom w:type="dxa" w:w="80"/>
+              <w:right w:type="dxa" w:w="120"/>
+            </w:tcMar>
+          </w:tcPr>
+          <w:p>
+            <w:r>
+              <w:rPr>
+                <w:color w:val="555555"/>
+                <w:sz w:val="19"/>
+                <w:szCs w:val="19"/>
+              </w:rPr>
+              <w:t xml:space="preserve">Lead-in</w:t>
+            </w:r>
+          </w:p>
+        </w:tc>
+        <w:tc>
+          <w:tcPr>
+            <w:tcW w:type="dxa" w:w="6260"/>
+            <w:tcMar>
+              <w:top w:type="dxa" w:w="80"/>
+              <w:left w:type="dxa" w:w="120"/>
+              <w:bottom w:type="dxa" w:w="80"/>
+              <w:right w:type="dxa" w:w="120"/>
+            </w:tcMar>
+          </w:tcPr>
+          <w:p>
+            <w:r>
+              <w:rPr>
+                <w:b w:val="false"/>
+                <w:bCs w:val="false"/>
+                <w:color w:val="000000"/>
+                <w:sz w:val="21"/>
+                <w:szCs w:val="21"/>
+              </w:rPr>
+              <w:t xml:space="preserve">So here is the statement we are staking our name to.</w:t>
+            </w:r>
+          </w:p>
+        </w:tc>
+      </w:tr>
+      <w:tr>
+        <w:tc>
+          <w:tcPr>
+            <w:tcW w:type="dxa" w:w="3100"/>
+            <w:tcMar>
+              <w:top w:type="dxa" w:w="80"/>
+              <w:left w:type="dxa" w:w="120"/>
+              <w:bottom w:type="dxa" w:w="80"/>
+              <w:right w:type="dxa" w:w="120"/>
+            </w:tcMar>
+          </w:tcPr>
+          <w:p>
+            <w:r>
+              <w:rPr>
+                <w:color w:val="555555"/>
+                <w:sz w:val="19"/>
+                <w:szCs w:val="19"/>
+              </w:rPr>
+              <w:t xml:space="preserve">Cole’s quote</w:t>
+            </w:r>
+          </w:p>
+        </w:tc>
+        <w:tc>
+          <w:tcPr>
+            <w:tcW w:type="dxa" w:w="6260"/>
+            <w:tcMar>
+              <w:top w:type="dxa" w:w="80"/>
+              <w:left w:type="dxa" w:w="120"/>
+              <w:bottom w:type="dxa" w:w="80"/>
+              <w:right w:type="dxa" w:w="120"/>
+            </w:tcMar>
+          </w:tcPr>
+          <w:p>
+            <w:r>
+              <w:rPr>
+                <w:b w:val="false"/>
+                <w:bCs w:val="false"/>
+                <w:color w:val="000000"/>
+                <w:sz w:val="21"/>
+                <w:szCs w:val="21"/>
+              </w:rPr>
+              <w:t xml:space="preserve">We care about how we spend our hours, not just how many we log. Getting good at *Siege* and getting good at flute turned out to be the same problem: hours alone don't do it. Deliberate practice has to be practiced too, on purpose, with feedback, every time. As student leaders, that's the mindset we're building: spending our time where it actually compounds, and helping the people around us find the same kind of leverage in theirs. The mindset we are most focused on developing ourselves is that same intentional, deliberate practice, turned inward.</w:t>
+            </w:r>
+          </w:p>
+        </w:tc>
+      </w:tr>
+      <w:tr>
+        <w:tc>
+          <w:tcPr>
+            <w:tcW w:type="dxa" w:w="3100"/>
+            <w:tcMar>
+              <w:top w:type="dxa" w:w="80"/>
+              <w:left w:type="dxa" w:w="120"/>
+              <w:bottom w:type="dxa" w:w="80"/>
+              <w:right w:type="dxa" w:w="120"/>
+            </w:tcMar>
+          </w:tcPr>
+          <w:p>
+            <w:r>
+              <w:rPr>
+                <w:color w:val="555555"/>
+                <w:sz w:val="19"/>
+                <w:szCs w:val="19"/>
+              </w:rPr>
+              <w:t xml:space="preserve">Signed</w:t>
+            </w:r>
+          </w:p>
+        </w:tc>
+        <w:tc>
+          <w:tcPr>
+            <w:tcW w:type="dxa" w:w="6260"/>
+            <w:tcMar>
+              <w:top w:type="dxa" w:w="80"/>
+              <w:left w:type="dxa" w:w="120"/>
+              <w:bottom w:type="dxa" w:w="80"/>
+              <w:right w:type="dxa" w:w="120"/>
+            </w:tcMar>
+          </w:tcPr>
+          <w:p>
+            <w:r>
+              <w:rPr>
+                <w:b w:val="false"/>
+                <w:bCs w:val="false"/>
+                <w:color w:val="000000"/>
+                <w:sz w:val="21"/>
+                <w:szCs w:val="21"/>
+              </w:rPr>
+              <w:t xml:space="preserve">Collin, Bryan, Bonga, Eduard, and Cole</w:t>
+            </w:r>
+          </w:p>
+        </w:tc>
+      </w:tr>
+    </w:tbl>
+    <w:p>
+      <w:pPr>
+        <w:pStyle w:val="Heading1"/>
+        <w:spacing w:after="140" w:before="320"/>
+      </w:pPr>
+      <w:r>
+        <w:t xml:space="preserve">Slide 21 — Eduard · LinkedIn</w:t>
+      </w:r>
+    </w:p>
+    <w:tbl>
+      <w:tblPr>
+        <w:tblW w:type="dxa" w:w="9360"/>
+        <w:tblBorders>
+          <w:top w:val="single" w:color="D8D4CA" w:sz="2"/>
+          <w:left w:val="single" w:color="D8D4CA" w:sz="2"/>
+          <w:bottom w:val="single" w:color="D8D4CA" w:sz="2"/>
+          <w:right w:val="single" w:color="D8D4CA" w:sz="2"/>
+          <w:insideH w:val="single" w:color="E8E5DD" w:sz="2"/>
+          <w:insideV w:val="single" w:color="E8E5DD" w:sz="2"/>
+        </w:tblBorders>
+      </w:tblPr>
+      <w:tblGrid>
+        <w:gridCol w:w="3100"/>
+        <w:gridCol w:w="6260"/>
+      </w:tblGrid>
+      <w:tr>
+        <w:tc>
+          <w:tcPr>
+            <w:tcW w:type="dxa" w:w="3100"/>
+            <w:tcMar>
+              <w:top w:type="dxa" w:w="80"/>
+              <w:left w:type="dxa" w:w="120"/>
+              <w:bottom w:type="dxa" w:w="80"/>
+              <w:right w:type="dxa" w:w="120"/>
+            </w:tcMar>
+          </w:tcPr>
+          <w:p>
+            <w:r>
+              <w:rPr>
+                <w:color w:val="555555"/>
+                <w:sz w:val="19"/>
+                <w:szCs w:val="19"/>
+              </w:rPr>
+              <w:t xml:space="preserve">Label above name</w:t>
+            </w:r>
+          </w:p>
+        </w:tc>
+        <w:tc>
+          <w:tcPr>
+            <w:tcW w:type="dxa" w:w="6260"/>
+            <w:tcMar>
+              <w:top w:type="dxa" w:w="80"/>
+              <w:left w:type="dxa" w:w="120"/>
+              <w:bottom w:type="dxa" w:w="80"/>
+              <w:right w:type="dxa" w:w="120"/>
+            </w:tcMar>
+          </w:tcPr>
+          <w:p>
+            <w:r>
+              <w:rPr>
+                <w:b w:val="false"/>
+                <w:bCs w:val="false"/>
+                <w:color w:val="000000"/>
+                <w:sz w:val="21"/>
+                <w:szCs w:val="21"/>
+              </w:rPr>
+              <w:t xml:space="preserve">Section 5 — LinkedIn profile draft</w:t>
+            </w:r>
+          </w:p>
+        </w:tc>
+      </w:tr>
+      <w:tr>
+        <w:tc>
+          <w:tcPr>
+            <w:tcW w:type="dxa" w:w="3100"/>
+            <w:tcMar>
+              <w:top w:type="dxa" w:w="80"/>
+              <w:left w:type="dxa" w:w="120"/>
+              <w:bottom w:type="dxa" w:w="80"/>
+              <w:right w:type="dxa" w:w="120"/>
+            </w:tcMar>
+          </w:tcPr>
+          <w:p>
+            <w:r>
+              <w:rPr>
+                <w:color w:val="555555"/>
+                <w:sz w:val="19"/>
+                <w:szCs w:val="19"/>
+              </w:rPr>
+              <w:t xml:space="preserve">Name</w:t>
+            </w:r>
+          </w:p>
+        </w:tc>
+        <w:tc>
+          <w:tcPr>
+            <w:tcW w:type="dxa" w:w="6260"/>
+            <w:tcMar>
+              <w:top w:type="dxa" w:w="80"/>
+              <w:left w:type="dxa" w:w="120"/>
+              <w:bottom w:type="dxa" w:w="80"/>
+              <w:right w:type="dxa" w:w="120"/>
+            </w:tcMar>
+          </w:tcPr>
+          <w:p>
+            <w:r>
+              <w:rPr>
+                <w:b w:val="false"/>
+                <w:bCs w:val="false"/>
+                <w:color w:val="000000"/>
+                <w:sz w:val="21"/>
+                <w:szCs w:val="21"/>
+              </w:rPr>
+              <w:t xml:space="preserve">Eduard Varga</w:t>
+            </w:r>
+          </w:p>
+        </w:tc>
+      </w:tr>
+      <w:tr>
+        <w:tc>
+          <w:tcPr>
+            <w:tcW w:type="dxa" w:w="3100"/>
+            <w:tcMar>
+              <w:top w:type="dxa" w:w="80"/>
+              <w:left w:type="dxa" w:w="120"/>
+              <w:bottom w:type="dxa" w:w="80"/>
+              <w:right w:type="dxa" w:w="120"/>
+            </w:tcMar>
+          </w:tcPr>
+          <w:p>
+            <w:r>
+              <w:rPr>
+                <w:color w:val="555555"/>
+                <w:sz w:val="19"/>
+                <w:szCs w:val="19"/>
+              </w:rPr>
+              <w:t xml:space="preserve">Line under the name</w:t>
+            </w:r>
+          </w:p>
+        </w:tc>
+        <w:tc>
+          <w:tcPr>
+            <w:tcW w:type="dxa" w:w="6260"/>
+            <w:tcMar>
+              <w:top w:type="dxa" w:w="80"/>
+              <w:left w:type="dxa" w:w="120"/>
+              <w:bottom w:type="dxa" w:w="80"/>
+              <w:right w:type="dxa" w:w="120"/>
+            </w:tcMar>
+          </w:tcPr>
+          <w:p>
+            <w:r>
+              <w:rPr>
+                <w:b w:val="false"/>
+                <w:bCs w:val="false"/>
+                <w:color w:val="000000"/>
+                <w:sz w:val="21"/>
+                <w:szCs w:val="21"/>
+              </w:rPr>
+              <w:t xml:space="preserve">Honors Finance Student, UNF</w:t>
+            </w:r>
+          </w:p>
+        </w:tc>
+      </w:tr>
+      <w:tr>
+        <w:tc>
+          <w:tcPr>
+            <w:tcW w:type="dxa" w:w="3100"/>
+            <w:tcMar>
+              <w:top w:type="dxa" w:w="80"/>
+              <w:left w:type="dxa" w:w="120"/>
+              <w:bottom w:type="dxa" w:w="80"/>
+              <w:right w:type="dxa" w:w="120"/>
+            </w:tcMar>
+          </w:tcPr>
+          <w:p>
+            <w:r>
+              <w:rPr>
+                <w:color w:val="555555"/>
+                <w:sz w:val="19"/>
+                <w:szCs w:val="19"/>
+              </w:rPr>
+              <w:t xml:space="preserve">Photo file (in public/)</w:t>
+            </w:r>
+          </w:p>
+        </w:tc>
+        <w:tc>
+          <w:tcPr>
+            <w:tcW w:type="dxa" w:w="6260"/>
+            <w:tcMar>
+              <w:top w:type="dxa" w:w="80"/>
+              <w:left w:type="dxa" w:w="120"/>
+              <w:bottom w:type="dxa" w:w="80"/>
+              <w:right w:type="dxa" w:w="120"/>
+            </w:tcMar>
+          </w:tcPr>
+          <w:p>
+            <w:r>
+              <w:rPr>
+                <w:b w:val="false"/>
+                <w:bCs w:val="false"/>
+                <w:color w:val="000000"/>
+                <w:sz w:val="21"/>
+                <w:szCs w:val="21"/>
+              </w:rPr>
+              <w:t xml:space="preserve">/eduard.png</w:t>
+            </w:r>
+          </w:p>
+        </w:tc>
+      </w:tr>
+      <w:tr>
+        <w:tc>
+          <w:tcPr>
+            <w:tcW w:type="dxa" w:w="3100"/>
+            <w:tcMar>
+              <w:top w:type="dxa" w:w="80"/>
+              <w:left w:type="dxa" w:w="120"/>
+              <w:bottom w:type="dxa" w:w="80"/>
+              <w:right w:type="dxa" w:w="120"/>
+            </w:tcMar>
+          </w:tcPr>
+          <w:p>
+            <w:r>
+              <w:rPr>
+                <w:color w:val="555555"/>
+                <w:sz w:val="19"/>
+                <w:szCs w:val="19"/>
+              </w:rPr>
+              <w:t xml:space="preserve">Photo caption</w:t>
+            </w:r>
+          </w:p>
+        </w:tc>
+        <w:tc>
+          <w:tcPr>
+            <w:tcW w:type="dxa" w:w="6260"/>
+            <w:tcMar>
+              <w:top w:type="dxa" w:w="80"/>
+              <w:left w:type="dxa" w:w="120"/>
+              <w:bottom w:type="dxa" w:w="80"/>
+              <w:right w:type="dxa" w:w="120"/>
+            </w:tcMar>
+          </w:tcPr>
+          <w:p>
+            <w:r>
+              <w:rPr>
+                <w:b w:val="false"/>
+                <w:bCs w:val="false"/>
+                <w:color w:val="000000"/>
+                <w:sz w:val="21"/>
+                <w:szCs w:val="21"/>
+              </w:rPr>
+              <w:t xml:space="preserve">linkedin.com/in/eduardvarga</w:t>
+            </w:r>
+          </w:p>
+        </w:tc>
+      </w:tr>
+      <w:tr>
+        <w:tc>
+          <w:tcPr>
+            <w:tcW w:type="dxa" w:w="3100"/>
+            <w:tcMar>
+              <w:top w:type="dxa" w:w="80"/>
+              <w:left w:type="dxa" w:w="120"/>
+              <w:bottom w:type="dxa" w:w="80"/>
+              <w:right w:type="dxa" w:w="120"/>
+            </w:tcMar>
+          </w:tcPr>
+          <w:p>
+            <w:r>
+              <w:rPr>
+                <w:color w:val="555555"/>
+                <w:sz w:val="19"/>
+                <w:szCs w:val="19"/>
+              </w:rPr>
+              <w:t xml:space="preserve">Fact 1 label</w:t>
+            </w:r>
+          </w:p>
+        </w:tc>
+        <w:tc>
+          <w:tcPr>
+            <w:tcW w:type="dxa" w:w="6260"/>
+            <w:tcMar>
+              <w:top w:type="dxa" w:w="80"/>
+              <w:left w:type="dxa" w:w="120"/>
+              <w:bottom w:type="dxa" w:w="80"/>
+              <w:right w:type="dxa" w:w="120"/>
+            </w:tcMar>
+          </w:tcPr>
+          <w:p>
+            <w:r>
+              <w:rPr>
+                <w:b w:val="false"/>
+                <w:bCs w:val="false"/>
+                <w:color w:val="000000"/>
+                <w:sz w:val="21"/>
+                <w:szCs w:val="21"/>
+              </w:rPr>
+              <w:t xml:space="preserve">School</w:t>
+            </w:r>
+          </w:p>
+        </w:tc>
+      </w:tr>
+      <w:tr>
+        <w:tc>
+          <w:tcPr>
+            <w:tcW w:type="dxa" w:w="3100"/>
+            <w:tcMar>
+              <w:top w:type="dxa" w:w="80"/>
+              <w:left w:type="dxa" w:w="120"/>
+              <w:bottom w:type="dxa" w:w="80"/>
+              <w:right w:type="dxa" w:w="120"/>
+            </w:tcMar>
+          </w:tcPr>
+          <w:p>
+            <w:r>
+              <w:rPr>
+                <w:color w:val="555555"/>
+                <w:sz w:val="19"/>
+                <w:szCs w:val="19"/>
+              </w:rPr>
+              <w:t xml:space="preserve">Fact 1 value</w:t>
+            </w:r>
+          </w:p>
+        </w:tc>
+        <w:tc>
+          <w:tcPr>
+            <w:tcW w:type="dxa" w:w="6260"/>
+            <w:tcMar>
+              <w:top w:type="dxa" w:w="80"/>
+              <w:left w:type="dxa" w:w="120"/>
+              <w:bottom w:type="dxa" w:w="80"/>
+              <w:right w:type="dxa" w:w="120"/>
+            </w:tcMar>
+          </w:tcPr>
+          <w:p>
+            <w:r>
+              <w:rPr>
+                <w:b w:val="false"/>
+                <w:bCs w:val="false"/>
+                <w:color w:val="000000"/>
+                <w:sz w:val="21"/>
+                <w:szCs w:val="21"/>
+              </w:rPr>
+              <w:t xml:space="preserve">UNF, Coggin Honors</w:t>
+            </w:r>
+          </w:p>
+        </w:tc>
+      </w:tr>
+      <w:tr>
+        <w:tc>
+          <w:tcPr>
+            <w:tcW w:type="dxa" w:w="3100"/>
+            <w:tcMar>
+              <w:top w:type="dxa" w:w="80"/>
+              <w:left w:type="dxa" w:w="120"/>
+              <w:bottom w:type="dxa" w:w="80"/>
+              <w:right w:type="dxa" w:w="120"/>
+            </w:tcMar>
+          </w:tcPr>
+          <w:p>
+            <w:r>
+              <w:rPr>
+                <w:color w:val="555555"/>
+                <w:sz w:val="19"/>
+                <w:szCs w:val="19"/>
+              </w:rPr>
+              <w:t xml:space="preserve">Fact 2 label</w:t>
+            </w:r>
+          </w:p>
+        </w:tc>
+        <w:tc>
+          <w:tcPr>
+            <w:tcW w:type="dxa" w:w="6260"/>
+            <w:tcMar>
+              <w:top w:type="dxa" w:w="80"/>
+              <w:left w:type="dxa" w:w="120"/>
+              <w:bottom w:type="dxa" w:w="80"/>
+              <w:right w:type="dxa" w:w="120"/>
+            </w:tcMar>
+          </w:tcPr>
+          <w:p>
+            <w:r>
+              <w:rPr>
+                <w:b w:val="false"/>
+                <w:bCs w:val="false"/>
+                <w:color w:val="000000"/>
+                <w:sz w:val="21"/>
+                <w:szCs w:val="21"/>
+              </w:rPr>
+              <w:t xml:space="preserve">Major</w:t>
+            </w:r>
+          </w:p>
+        </w:tc>
+      </w:tr>
+      <w:tr>
+        <w:tc>
+          <w:tcPr>
+            <w:tcW w:type="dxa" w:w="3100"/>
+            <w:tcMar>
+              <w:top w:type="dxa" w:w="80"/>
+              <w:left w:type="dxa" w:w="120"/>
+              <w:bottom w:type="dxa" w:w="80"/>
+              <w:right w:type="dxa" w:w="120"/>
+            </w:tcMar>
+          </w:tcPr>
+          <w:p>
+            <w:r>
+              <w:rPr>
+                <w:color w:val="555555"/>
+                <w:sz w:val="19"/>
+                <w:szCs w:val="19"/>
+              </w:rPr>
+              <w:t xml:space="preserve">Fact 2 value</w:t>
+            </w:r>
+          </w:p>
+        </w:tc>
+        <w:tc>
+          <w:tcPr>
+            <w:tcW w:type="dxa" w:w="6260"/>
+            <w:tcMar>
+              <w:top w:type="dxa" w:w="80"/>
+              <w:left w:type="dxa" w:w="120"/>
+              <w:bottom w:type="dxa" w:w="80"/>
+              <w:right w:type="dxa" w:w="120"/>
+            </w:tcMar>
+          </w:tcPr>
+          <w:p>
+            <w:r>
+              <w:rPr>
+                <w:b w:val="false"/>
+                <w:bCs w:val="false"/>
+                <w:color w:val="000000"/>
+                <w:sz w:val="21"/>
+                <w:szCs w:val="21"/>
+              </w:rPr>
+              <w:t xml:space="preserve">Finance</w:t>
+            </w:r>
+          </w:p>
+        </w:tc>
+      </w:tr>
+      <w:tr>
+        <w:tc>
+          <w:tcPr>
+            <w:tcW w:type="dxa" w:w="3100"/>
+            <w:tcMar>
+              <w:top w:type="dxa" w:w="80"/>
+              <w:left w:type="dxa" w:w="120"/>
+              <w:bottom w:type="dxa" w:w="80"/>
+              <w:right w:type="dxa" w:w="120"/>
+            </w:tcMar>
+          </w:tcPr>
+          <w:p>
+            <w:r>
+              <w:rPr>
+                <w:color w:val="555555"/>
+                <w:sz w:val="19"/>
+                <w:szCs w:val="19"/>
+              </w:rPr>
+              <w:t xml:space="preserve">Fact 3 label</w:t>
+            </w:r>
+          </w:p>
+        </w:tc>
+        <w:tc>
+          <w:tcPr>
+            <w:tcW w:type="dxa" w:w="6260"/>
+            <w:tcMar>
+              <w:top w:type="dxa" w:w="80"/>
+              <w:left w:type="dxa" w:w="120"/>
+              <w:bottom w:type="dxa" w:w="80"/>
+              <w:right w:type="dxa" w:w="120"/>
+            </w:tcMar>
+          </w:tcPr>
+          <w:p>
+            <w:r>
+              <w:rPr>
+                <w:b w:val="false"/>
+                <w:bCs w:val="false"/>
+                <w:color w:val="000000"/>
+                <w:sz w:val="21"/>
+                <w:szCs w:val="21"/>
+              </w:rPr>
+              <w:t xml:space="preserve">Matches reffed</w:t>
+            </w:r>
+          </w:p>
+        </w:tc>
+      </w:tr>
+      <w:tr>
+        <w:tc>
+          <w:tcPr>
+            <w:tcW w:type="dxa" w:w="3100"/>
+            <w:tcMar>
+              <w:top w:type="dxa" w:w="80"/>
+              <w:left w:type="dxa" w:w="120"/>
+              <w:bottom w:type="dxa" w:w="80"/>
+              <w:right w:type="dxa" w:w="120"/>
+            </w:tcMar>
+          </w:tcPr>
+          <w:p>
+            <w:r>
+              <w:rPr>
+                <w:color w:val="555555"/>
+                <w:sz w:val="19"/>
+                <w:szCs w:val="19"/>
+              </w:rPr>
+              <w:t xml:space="preserve">Fact 3 value</w:t>
+            </w:r>
+          </w:p>
+        </w:tc>
+        <w:tc>
+          <w:tcPr>
+            <w:tcW w:type="dxa" w:w="6260"/>
+            <w:tcMar>
+              <w:top w:type="dxa" w:w="80"/>
+              <w:left w:type="dxa" w:w="120"/>
+              <w:bottom w:type="dxa" w:w="80"/>
+              <w:right w:type="dxa" w:w="120"/>
+            </w:tcMar>
+          </w:tcPr>
+          <w:p>
+            <w:r>
+              <w:rPr>
+                <w:b w:val="false"/>
+                <w:bCs w:val="false"/>
+                <w:color w:val="000000"/>
+                <w:sz w:val="21"/>
+                <w:szCs w:val="21"/>
+              </w:rPr>
+              <w:t xml:space="preserve">200+</w:t>
+            </w:r>
+          </w:p>
+        </w:tc>
+      </w:tr>
+      <w:tr>
+        <w:tc>
+          <w:tcPr>
+            <w:tcW w:type="dxa" w:w="3100"/>
+            <w:tcMar>
+              <w:top w:type="dxa" w:w="80"/>
+              <w:left w:type="dxa" w:w="120"/>
+              <w:bottom w:type="dxa" w:w="80"/>
+              <w:right w:type="dxa" w:w="120"/>
+            </w:tcMar>
+          </w:tcPr>
+          <w:p>
+            <w:r>
+              <w:rPr>
+                <w:color w:val="555555"/>
+                <w:sz w:val="19"/>
+                <w:szCs w:val="19"/>
+              </w:rPr>
+              <w:t xml:space="preserve">Quote under the facts</w:t>
+            </w:r>
+          </w:p>
+        </w:tc>
+        <w:tc>
+          <w:tcPr>
+            <w:tcW w:type="dxa" w:w="6260"/>
+            <w:tcMar>
+              <w:top w:type="dxa" w:w="80"/>
+              <w:left w:type="dxa" w:w="120"/>
+              <w:bottom w:type="dxa" w:w="80"/>
+              <w:right w:type="dxa" w:w="120"/>
+            </w:tcMar>
+          </w:tcPr>
+          <w:p>
+            <w:r>
+              <w:rPr>
+                <w:b w:val="false"/>
+                <w:bCs w:val="false"/>
+                <w:color w:val="000000"/>
+                <w:sz w:val="21"/>
+                <w:szCs w:val="21"/>
+              </w:rPr>
+              <w:t xml:space="preserve">“Honors Finance Student at UNF: building habits one repetition at a time.” Coggin Honors finance major who referees 200+ soccer matches a year, trains new hires at a pizza shop, and volunteers in animal welfare and senior care.</w:t>
+            </w:r>
+          </w:p>
+        </w:tc>
+      </w:tr>
+    </w:tbl>
+    <w:p>
+      <w:pPr>
+        <w:pStyle w:val="Heading1"/>
+        <w:spacing w:after="140" w:before="320"/>
+      </w:pPr>
+      <w:r>
+        <w:t xml:space="preserve">Slide 22 — End</w:t>
+      </w:r>
+    </w:p>
+    <w:tbl>
+      <w:tblPr>
+        <w:tblW w:type="dxa" w:w="9360"/>
+        <w:tblBorders>
+          <w:top w:val="single" w:color="D8D4CA" w:sz="2"/>
+          <w:left w:val="single" w:color="D8D4CA" w:sz="2"/>
+          <w:bottom w:val="single" w:color="D8D4CA" w:sz="2"/>
+          <w:right w:val="single" w:color="D8D4CA" w:sz="2"/>
+          <w:insideH w:val="single" w:color="E8E5DD" w:sz="2"/>
+          <w:insideV w:val="single" w:color="E8E5DD" w:sz="2"/>
+        </w:tblBorders>
+      </w:tblPr>
+      <w:tblGrid>
+        <w:gridCol w:w="3100"/>
+        <w:gridCol w:w="6260"/>
+      </w:tblGrid>
+      <w:tr>
+        <w:tc>
+          <w:tcPr>
+            <w:tcW w:type="dxa" w:w="3100"/>
+            <w:tcMar>
+              <w:top w:type="dxa" w:w="80"/>
+              <w:left w:type="dxa" w:w="120"/>
+              <w:bottom w:type="dxa" w:w="80"/>
+              <w:right w:type="dxa" w:w="120"/>
+            </w:tcMar>
+          </w:tcPr>
+          <w:p>
+            <w:r>
+              <w:rPr>
+                <w:color w:val="555555"/>
+                <w:sz w:val="19"/>
+                <w:szCs w:val="19"/>
+              </w:rPr>
+              <w:t xml:space="preserve">Line 1</w:t>
+            </w:r>
+          </w:p>
+        </w:tc>
+        <w:tc>
+          <w:tcPr>
+            <w:tcW w:type="dxa" w:w="6260"/>
+            <w:tcMar>
+              <w:top w:type="dxa" w:w="80"/>
+              <w:left w:type="dxa" w:w="120"/>
+              <w:bottom w:type="dxa" w:w="80"/>
+              <w:right w:type="dxa" w:w="120"/>
+            </w:tcMar>
+          </w:tcPr>
+          <w:p>
+            <w:r>
+              <w:rPr>
+                <w:b w:val="false"/>
+                <w:bCs w:val="false"/>
+                <w:color w:val="000000"/>
+                <w:sz w:val="21"/>
+                <w:szCs w:val="21"/>
+              </w:rPr>
+              <w:t xml:space="preserve">Hours are the</w:t>
+            </w:r>
+          </w:p>
+        </w:tc>
+      </w:tr>
+      <w:tr>
+        <w:tc>
+          <w:tcPr>
+            <w:tcW w:type="dxa" w:w="3100"/>
+            <w:tcMar>
+              <w:top w:type="dxa" w:w="80"/>
+              <w:left w:type="dxa" w:w="120"/>
+              <w:bottom w:type="dxa" w:w="80"/>
+              <w:right w:type="dxa" w:w="120"/>
+            </w:tcMar>
+          </w:tcPr>
+          <w:p>
+            <w:r>
+              <w:rPr>
+                <w:color w:val="555555"/>
+                <w:sz w:val="19"/>
+                <w:szCs w:val="19"/>
+              </w:rPr>
+              <w:t xml:space="preserve">Line 2</w:t>
+            </w:r>
+          </w:p>
+        </w:tc>
+        <w:tc>
+          <w:tcPr>
+            <w:tcW w:type="dxa" w:w="6260"/>
+            <w:tcMar>
+              <w:top w:type="dxa" w:w="80"/>
+              <w:left w:type="dxa" w:w="120"/>
+              <w:bottom w:type="dxa" w:w="80"/>
+              <w:right w:type="dxa" w:w="120"/>
+            </w:tcMar>
+          </w:tcPr>
+          <w:p>
+            <w:r>
+              <w:rPr>
+                <w:b w:val="false"/>
+                <w:bCs w:val="false"/>
+                <w:color w:val="000000"/>
+                <w:sz w:val="21"/>
+                <w:szCs w:val="21"/>
+              </w:rPr>
+              <w:t xml:space="preserve">container.</w:t>
+            </w:r>
+          </w:p>
+        </w:tc>
+      </w:tr>
+      <w:tr>
+        <w:tc>
+          <w:tcPr>
+            <w:tcW w:type="dxa" w:w="3100"/>
+            <w:tcMar>
+              <w:top w:type="dxa" w:w="80"/>
+              <w:left w:type="dxa" w:w="120"/>
+              <w:bottom w:type="dxa" w:w="80"/>
+              <w:right w:type="dxa" w:w="120"/>
+            </w:tcMar>
+          </w:tcPr>
+          <w:p>
+            <w:r>
+              <w:rPr>
+                <w:color w:val="555555"/>
+                <w:sz w:val="19"/>
+                <w:szCs w:val="19"/>
+              </w:rPr>
+              <w:t xml:space="preserve">Line 3 (green italic)</w:t>
+            </w:r>
+          </w:p>
+        </w:tc>
+        <w:tc>
+          <w:tcPr>
+            <w:tcW w:type="dxa" w:w="6260"/>
+            <w:tcMar>
+              <w:top w:type="dxa" w:w="80"/>
+              <w:left w:type="dxa" w:w="120"/>
+              <w:bottom w:type="dxa" w:w="80"/>
+              <w:right w:type="dxa" w:w="120"/>
+            </w:tcMar>
+          </w:tcPr>
+          <w:p>
+            <w:r>
+              <w:rPr>
+                <w:b w:val="false"/>
+                <w:bCs w:val="false"/>
+                <w:color w:val="000000"/>
+                <w:sz w:val="21"/>
+                <w:szCs w:val="21"/>
+              </w:rPr>
+              <w:t xml:space="preserve">You choose the content.</w:t>
+            </w:r>
+          </w:p>
+        </w:tc>
+      </w:tr>
+    </w:tbl>
+    <w:p>
+      <w:r>
+        <w:br w:type="page"/>
+      </w:r>
+    </w:p>
+    <w:p>
+      <w:pPr>
+        <w:pStyle w:val="Heading1"/>
+        <w:spacing w:after="140" w:before="320"/>
+      </w:pPr>
+      <w:r>
+        <w:t xml:space="preserve">Section 2 — the slide that does not exist yet</w:t>
+      </w:r>
+    </w:p>
+    <w:p>
+      <w:pPr>
+        <w:spacing w:after="120"/>
+      </w:pPr>
+      <w:r>
+        <w:rPr>
+          <w:sz w:val="21"/>
+          <w:szCs w:val="21"/>
+        </w:rPr>
+        <w:t xml:space="preserve">The assignment asks you to connect the Outliers lesson to the LinkedIn Learning module “Developing Leadership Mindsets”. Nothing in the deck does that yet — it is the only section without slides.</w:t>
+      </w:r>
+    </w:p>
+    <w:p>
+      <w:pPr>
+        <w:spacing w:after="200"/>
+      </w:pPr>
+      <w:r>
+        <w:rPr>
+          <w:sz w:val="21"/>
+          <w:szCs w:val="21"/>
+        </w:rPr>
+        <w:t xml:space="preserve">Rough notes are enough. Send them back and they get built into a chapter that sits between the argument and the food-security section.</w:t>
+      </w:r>
+    </w:p>
+    <w:tbl>
+      <w:tblPr>
+        <w:tblW w:type="dxa" w:w="9360"/>
+        <w:tblBorders>
+          <w:top w:val="single" w:color="D8D4CA" w:sz="2"/>
+          <w:left w:val="single" w:color="D8D4CA" w:sz="2"/>
+          <w:bottom w:val="single" w:color="D8D4CA" w:sz="2"/>
+          <w:right w:val="single" w:color="D8D4CA" w:sz="2"/>
+          <w:insideH w:val="single" w:color="E8E5DD" w:sz="2"/>
+          <w:insideV w:val="single" w:color="E8E5DD" w:sz="2"/>
+        </w:tblBorders>
+      </w:tblPr>
+      <w:tblGrid>
+        <w:gridCol w:w="3100"/>
+        <w:gridCol w:w="6260"/>
+      </w:tblGrid>
+      <w:tr>
+        <w:tc>
+          <w:tcPr>
+            <w:tcW w:type="dxa" w:w="3100"/>
+            <w:tcMar>
+              <w:top w:type="dxa" w:w="80"/>
+              <w:left w:type="dxa" w:w="120"/>
+              <w:bottom w:type="dxa" w:w="80"/>
+              <w:right w:type="dxa" w:w="120"/>
+            </w:tcMar>
+          </w:tcPr>
+          <w:p>
+            <w:r>
+              <w:rPr>
+                <w:color w:val="555555"/>
+                <w:sz w:val="19"/>
+                <w:szCs w:val="19"/>
+              </w:rPr>
+              <w:t xml:space="preserve">Which mindset from the module you are using</w:t>
             </w:r>
           </w:p>
         </w:tc>
@@ -8474,7 +10438,7 @@
                 <w:sz w:val="19"/>
                 <w:szCs w:val="19"/>
               </w:rPr>
-              <w:t xml:space="preserve">Section 2 — anything specific from the module to quote</w:t>
+              <w:t xml:space="preserve">How it connects to hours vs. deliberate practice</w:t>
             </w:r>
           </w:p>
         </w:tc>
@@ -8520,7 +10484,7 @@
                 <w:sz w:val="19"/>
                 <w:szCs w:val="19"/>
               </w:rPr>
-              <w:t xml:space="preserve">Section 3 — how this applies to food insecurity / community service</w:t>
+              <w:t xml:space="preserve">A line from the module worth putting on screen</w:t>
             </w:r>
           </w:p>
         </w:tc>
@@ -8566,53 +10530,7 @@
                 <w:sz w:val="19"/>
                 <w:szCs w:val="19"/>
               </w:rPr>
-              <w:t xml:space="preserve">Section 3 — a concrete example or number worth putting on screen</w:t>
-            </w:r>
-          </w:p>
-        </w:tc>
-        <w:tc>
-          <w:tcPr>
-            <w:tcW w:type="dxa" w:w="6260"/>
-            <w:tcMar>
-              <w:top w:type="dxa" w:w="80"/>
-              <w:left w:type="dxa" w:w="120"/>
-              <w:bottom w:type="dxa" w:w="80"/>
-              <w:right w:type="dxa" w:w="120"/>
-            </w:tcMar>
-          </w:tcPr>
-          <w:p>
-            <w:r>
-              <w:rPr>
-                <w:b w:val="false"/>
-                <w:bCs w:val="false"/>
-                <w:color w:val="000000"/>
-                <w:sz w:val="21"/>
-                <w:szCs w:val="21"/>
-              </w:rPr>
-              <w:t xml:space="preserve">[FILL IN]</w:t>
-            </w:r>
-          </w:p>
-        </w:tc>
-      </w:tr>
-      <w:tr>
-        <w:tc>
-          <w:tcPr>
-            <w:tcW w:type="dxa" w:w="3100"/>
-            <w:tcMar>
-              <w:top w:type="dxa" w:w="80"/>
-              <w:left w:type="dxa" w:w="120"/>
-              <w:bottom w:type="dxa" w:w="80"/>
-              <w:right w:type="dxa" w:w="120"/>
-            </w:tcMar>
-          </w:tcPr>
-          <w:p>
-            <w:r>
-              <w:rPr>
-                <w:color w:val="555555"/>
-                <w:sz w:val="19"/>
-                <w:szCs w:val="19"/>
-              </w:rPr>
-              <w:t xml:space="preserve">Section 4 — professional brand statement for the group</w:t>
+              <w:t xml:space="preserve">Where it shows up in your own group</w:t>
             </w:r>
           </w:p>
         </w:tc>
@@ -8653,7 +10571,7 @@
           <w:sz w:val="18"/>
           <w:szCs w:val="18"/>
         </w:rPr>
-        <w:t xml:space="preserve">These rows are plain text, not slides yet — send back whatever you have and the slides get built around it.</w:t>
+        <w:t xml:space="preserve">Delete any row you do not want and the slide gets built around what is left.</w:t>
       </w:r>
     </w:p>
     <w:sectPr>

</xml_diff>